<commit_message>
Análisis exploratorio en el informe
</commit_message>
<xml_diff>
--- a/Informe_Lab3_DS.docx
+++ b/Informe_Lab3_DS.docx
@@ -12,6 +12,7 @@
           <w:rFonts w:ascii="Segoe UI" w:hAnsi="Segoe UI" w:cs="Segoe UI"/>
           <w:sz w:val="54"/>
           <w:szCs w:val="54"/>
+          <w:lang w:val="es-US"/>
         </w:rPr>
       </w:pPr>
       <w:r>
@@ -20,7 +21,7 @@
           <w:rFonts w:ascii="Aptos Display" w:hAnsi="Aptos Display" w:cs="Segoe UI"/>
           <w:sz w:val="54"/>
           <w:szCs w:val="54"/>
-          <w:lang w:val="es-ES"/>
+          <w:lang w:val="es-US"/>
         </w:rPr>
         <w:t>Reconocimiento de Lenguaje de Señas</w:t>
       </w:r>
@@ -30,7 +31,7 @@
           <w:rFonts w:ascii="Aptos Display" w:hAnsi="Aptos Display" w:cs="Segoe UI"/>
           <w:sz w:val="54"/>
           <w:szCs w:val="54"/>
-          <w:lang w:val="es-ES"/>
+          <w:lang w:val="es-US"/>
         </w:rPr>
         <w:t>.</w:t>
       </w:r>
@@ -42,6 +43,7 @@
           <w:szCs w:val="54"/>
           <w:bdr w:val="none" w:sz="0" w:space="0" w:color="auto" w:frame="1"/>
           <w:shd w:val="clear" w:color="auto" w:fill="606060"/>
+          <w:lang w:val="es-US"/>
         </w:rPr>
         <w:t> </w:t>
       </w:r>
@@ -56,12 +58,13 @@
           <w:rFonts w:ascii="Segoe UI" w:hAnsi="Segoe UI" w:cs="Segoe UI"/>
           <w:sz w:val="18"/>
           <w:szCs w:val="18"/>
+          <w:lang w:val="es-US"/>
         </w:rPr>
       </w:pPr>
       <w:r>
         <w:rPr>
           <w:rStyle w:val="normaltextrun"/>
-          <w:lang w:val="es-ES"/>
+          <w:lang w:val="es-US"/>
         </w:rPr>
         <w:t>Universidad del Valle de Guatemala</w:t>
       </w:r>
@@ -70,6 +73,7 @@
           <w:rStyle w:val="eop"/>
           <w:bdr w:val="none" w:sz="0" w:space="0" w:color="auto" w:frame="1"/>
           <w:shd w:val="clear" w:color="auto" w:fill="606060"/>
+          <w:lang w:val="es-US"/>
         </w:rPr>
         <w:t> </w:t>
       </w:r>
@@ -84,12 +88,13 @@
           <w:rFonts w:ascii="Segoe UI" w:hAnsi="Segoe UI" w:cs="Segoe UI"/>
           <w:sz w:val="18"/>
           <w:szCs w:val="18"/>
+          <w:lang w:val="es-US"/>
         </w:rPr>
       </w:pPr>
       <w:r>
         <w:rPr>
           <w:rStyle w:val="normaltextrun"/>
-          <w:lang w:val="es-ES"/>
+          <w:lang w:val="es-US"/>
         </w:rPr>
         <w:t>Ciencia de Datos, sección 10</w:t>
       </w:r>
@@ -98,6 +103,7 @@
           <w:rStyle w:val="eop"/>
           <w:bdr w:val="none" w:sz="0" w:space="0" w:color="auto" w:frame="1"/>
           <w:shd w:val="clear" w:color="auto" w:fill="606060"/>
+          <w:lang w:val="es-US"/>
         </w:rPr>
         <w:t> </w:t>
       </w:r>
@@ -112,12 +118,13 @@
           <w:rFonts w:ascii="Segoe UI" w:hAnsi="Segoe UI" w:cs="Segoe UI"/>
           <w:sz w:val="18"/>
           <w:szCs w:val="18"/>
+          <w:lang w:val="es-US"/>
         </w:rPr>
       </w:pPr>
       <w:r>
         <w:rPr>
           <w:rStyle w:val="normaltextrun"/>
-          <w:lang w:val="es-ES"/>
+          <w:lang w:val="es-US"/>
         </w:rPr>
         <w:t>Castellanos, I; Pérez, M. y Rodríguez R.</w:t>
       </w:r>
@@ -126,6 +133,7 @@
           <w:rStyle w:val="eop"/>
           <w:bdr w:val="none" w:sz="0" w:space="0" w:color="auto" w:frame="1"/>
           <w:shd w:val="clear" w:color="auto" w:fill="606060"/>
+          <w:lang w:val="es-US"/>
         </w:rPr>
         <w:t> </w:t>
       </w:r>
@@ -133,10 +141,13 @@
     <w:p>
       <w:pPr>
         <w:pStyle w:val="Heading1"/>
-      </w:pPr>
-      <w:r>
-        <w:rPr>
-          <w:lang w:val="es-ES"/>
+        <w:rPr>
+          <w:lang w:val="es-US"/>
+        </w:rPr>
+      </w:pPr>
+      <w:r>
+        <w:rPr>
+          <w:lang w:val="es-US"/>
         </w:rPr>
         <w:t xml:space="preserve">Análisis </w:t>
       </w:r>
@@ -144,65 +155,1943 @@
         <w:rPr>
           <w:sz w:val="36"/>
           <w:szCs w:val="36"/>
-          <w:lang w:val="es-ES"/>
+          <w:lang w:val="es-US"/>
         </w:rPr>
         <w:t>exploratorio</w:t>
       </w:r>
       <w:r>
         <w:rPr>
-          <w:lang w:val="es-ES"/>
-        </w:rPr>
-        <w:t> </w:t>
-      </w:r>
-      <w:r>
-        <w:t> </w:t>
-      </w:r>
-    </w:p>
-    <w:p/>
+          <w:lang w:val="es-US"/>
+        </w:rPr>
+        <w:t>  </w:t>
+      </w:r>
+    </w:p>
+    <w:p>
+      <w:pPr>
+        <w:rPr>
+          <w:lang w:val="es-US"/>
+        </w:rPr>
+      </w:pPr>
+      <w:r>
+        <w:rPr>
+          <w:lang w:val="es-US"/>
+        </w:rPr>
+        <w:t xml:space="preserve">El conjunto de datos utilizado fue ASL </w:t>
+      </w:r>
+      <w:proofErr w:type="spellStart"/>
+      <w:r>
+        <w:rPr>
+          <w:lang w:val="es-US"/>
+        </w:rPr>
+        <w:t>Alphabet</w:t>
+      </w:r>
+      <w:proofErr w:type="spellEnd"/>
+      <w:r>
+        <w:rPr>
+          <w:lang w:val="es-US"/>
+        </w:rPr>
+        <w:t xml:space="preserve">, disponible en </w:t>
+      </w:r>
+      <w:proofErr w:type="spellStart"/>
+      <w:r>
+        <w:rPr>
+          <w:lang w:val="es-US"/>
+        </w:rPr>
+        <w:t>Kaggle</w:t>
+      </w:r>
+      <w:proofErr w:type="spellEnd"/>
+      <w:r>
+        <w:rPr>
+          <w:lang w:val="es-US"/>
+        </w:rPr>
+        <w:t>. Este contiene fotografías de manos que representan las letras del alfabeto del Lenguaje de Señas Americano. El conjunto de entrenamiento original está formado por aproximadamente 87,000 imágenes distribuidas en 29 clases: las 26 letras del alfabeto y las clases especiales del, </w:t>
+      </w:r>
+      <w:proofErr w:type="spellStart"/>
+      <w:r>
+        <w:rPr>
+          <w:lang w:val="es-US"/>
+        </w:rPr>
+        <w:t>nothing</w:t>
+      </w:r>
+      <w:proofErr w:type="spellEnd"/>
+      <w:r>
+        <w:rPr>
+          <w:lang w:val="es-US"/>
+        </w:rPr>
+        <w:t> y </w:t>
+      </w:r>
+      <w:proofErr w:type="spellStart"/>
+      <w:r>
+        <w:rPr>
+          <w:lang w:val="es-US"/>
+        </w:rPr>
+        <w:t>space</w:t>
+      </w:r>
+      <w:proofErr w:type="spellEnd"/>
+      <w:r>
+        <w:rPr>
+          <w:lang w:val="es-US"/>
+        </w:rPr>
+        <w:t>.</w:t>
+      </w:r>
+    </w:p>
+    <w:p>
+      <w:pPr>
+        <w:rPr>
+          <w:lang w:val="es-US"/>
+        </w:rPr>
+      </w:pPr>
+      <w:r>
+        <w:rPr>
+          <w:lang w:val="es-US"/>
+        </w:rPr>
+        <w:t>Las imágenes originales están almacenadas en formato JPG</w:t>
+      </w:r>
+      <w:r>
+        <w:rPr>
+          <w:lang w:val="es-US"/>
+        </w:rPr>
+        <w:t xml:space="preserve"> y </w:t>
+      </w:r>
+      <w:r>
+        <w:rPr>
+          <w:lang w:val="es-US"/>
+        </w:rPr>
+        <w:t>tienen una resolución de 200x200 píxeles. Cada una de las 29 clases contiene 3,000 imágenes</w:t>
+      </w:r>
+      <w:r>
+        <w:rPr>
+          <w:lang w:val="es-US"/>
+        </w:rPr>
+        <w:t>.</w:t>
+      </w:r>
+    </w:p>
+    <w:p>
+      <w:pPr>
+        <w:rPr>
+          <w:lang w:val="es-US"/>
+        </w:rPr>
+      </w:pPr>
+      <w:r>
+        <w:rPr>
+          <w:lang w:val="es-US"/>
+        </w:rPr>
+        <w:t xml:space="preserve">Para conocer visualmente los datos se seleccionaron ejemplos de diferentes letras del alfabeto. </w:t>
+      </w:r>
+      <w:r>
+        <w:rPr>
+          <w:lang w:val="es-US"/>
+        </w:rPr>
+        <w:t xml:space="preserve">Se </w:t>
+      </w:r>
+      <w:r>
+        <w:rPr>
+          <w:lang w:val="es-US"/>
+        </w:rPr>
+        <w:t>comprob</w:t>
+      </w:r>
+      <w:r>
+        <w:rPr>
+          <w:lang w:val="es-US"/>
+        </w:rPr>
+        <w:t>ó</w:t>
+      </w:r>
+      <w:r>
+        <w:rPr>
+          <w:lang w:val="es-US"/>
+        </w:rPr>
+        <w:t xml:space="preserve"> que las fotografías muestran la mano centrada y con un fondo relativamente uniforme, aunque existen pequeñas diferencias en posición, escala, orientación e iluminación.</w:t>
+      </w:r>
+    </w:p>
+    <w:p>
+      <w:pPr>
+        <w:rPr>
+          <w:lang w:val="es-US"/>
+        </w:rPr>
+      </w:pPr>
+      <w:r>
+        <w:rPr>
+          <w:b/>
+          <w:bCs/>
+          <w:lang w:val="es-US"/>
+        </w:rPr>
+        <w:t>Figura 1:</w:t>
+      </w:r>
+      <w:r>
+        <w:rPr>
+          <w:lang w:val="es-US"/>
+        </w:rPr>
+        <w:t xml:space="preserve"> Ejemplos de cinco letras distintas del alfabeto ASL.</w:t>
+      </w:r>
+    </w:p>
+    <w:p>
+      <w:pPr>
+        <w:rPr>
+          <w:lang w:val="es-US"/>
+        </w:rPr>
+      </w:pPr>
+      <w:r>
+        <w:rPr>
+          <w:lang w:val="es-US"/>
+        </w:rPr>
+        <w:drawing>
+          <wp:inline distT="0" distB="0" distL="0" distR="0" wp14:anchorId="348CDA7A" wp14:editId="317B1D80">
+            <wp:extent cx="5612130" cy="1220470"/>
+            <wp:effectExtent l="0" t="0" r="7620" b="0"/>
+            <wp:docPr id="1364651758" name="Picture 1"/>
+            <wp:cNvGraphicFramePr>
+              <a:graphicFrameLocks xmlns:a="http://schemas.openxmlformats.org/drawingml/2006/main" noChangeAspect="1"/>
+            </wp:cNvGraphicFramePr>
+            <a:graphic xmlns:a="http://schemas.openxmlformats.org/drawingml/2006/main">
+              <a:graphicData uri="http://schemas.openxmlformats.org/drawingml/2006/picture">
+                <pic:pic xmlns:pic="http://schemas.openxmlformats.org/drawingml/2006/picture">
+                  <pic:nvPicPr>
+                    <pic:cNvPr id="1364651758" name=""/>
+                    <pic:cNvPicPr/>
+                  </pic:nvPicPr>
+                  <pic:blipFill>
+                    <a:blip r:embed="rId6"/>
+                    <a:stretch>
+                      <a:fillRect/>
+                    </a:stretch>
+                  </pic:blipFill>
+                  <pic:spPr>
+                    <a:xfrm>
+                      <a:off x="0" y="0"/>
+                      <a:ext cx="5612130" cy="1220470"/>
+                    </a:xfrm>
+                    <a:prstGeom prst="rect">
+                      <a:avLst/>
+                    </a:prstGeom>
+                  </pic:spPr>
+                </pic:pic>
+              </a:graphicData>
+            </a:graphic>
+          </wp:inline>
+        </w:drawing>
+      </w:r>
+    </w:p>
+    <w:p>
+      <w:pPr>
+        <w:rPr>
+          <w:lang w:val="es-US"/>
+        </w:rPr>
+      </w:pPr>
+    </w:p>
+    <w:p>
+      <w:pPr>
+        <w:rPr>
+          <w:lang w:val="en-US"/>
+        </w:rPr>
+      </w:pPr>
+      <w:proofErr w:type="spellStart"/>
+      <w:r>
+        <w:rPr>
+          <w:lang w:val="en-US"/>
+        </w:rPr>
+        <w:t>Debido</w:t>
+      </w:r>
+      <w:proofErr w:type="spellEnd"/>
+      <w:r>
+        <w:rPr>
+          <w:lang w:val="en-US"/>
+        </w:rPr>
+        <w:t xml:space="preserve"> al </w:t>
+      </w:r>
+      <w:proofErr w:type="spellStart"/>
+      <w:r>
+        <w:rPr>
+          <w:lang w:val="en-US"/>
+        </w:rPr>
+        <w:t>costo</w:t>
+      </w:r>
+      <w:proofErr w:type="spellEnd"/>
+      <w:r>
+        <w:rPr>
+          <w:lang w:val="en-US"/>
+        </w:rPr>
+        <w:t xml:space="preserve"> </w:t>
+      </w:r>
+      <w:proofErr w:type="spellStart"/>
+      <w:r>
+        <w:rPr>
+          <w:lang w:val="en-US"/>
+        </w:rPr>
+        <w:t>computacional</w:t>
+      </w:r>
+      <w:proofErr w:type="spellEnd"/>
+      <w:r>
+        <w:rPr>
+          <w:lang w:val="en-US"/>
+        </w:rPr>
+        <w:t xml:space="preserve"> de </w:t>
+      </w:r>
+      <w:proofErr w:type="spellStart"/>
+      <w:r>
+        <w:rPr>
+          <w:lang w:val="en-US"/>
+        </w:rPr>
+        <w:t>trabajar</w:t>
+      </w:r>
+      <w:proofErr w:type="spellEnd"/>
+      <w:r>
+        <w:rPr>
+          <w:lang w:val="en-US"/>
+        </w:rPr>
+        <w:t xml:space="preserve"> con las 87,000 </w:t>
+      </w:r>
+      <w:proofErr w:type="spellStart"/>
+      <w:r>
+        <w:rPr>
+          <w:lang w:val="en-US"/>
+        </w:rPr>
+        <w:t>imágenes</w:t>
+      </w:r>
+      <w:proofErr w:type="spellEnd"/>
+      <w:r>
+        <w:rPr>
+          <w:lang w:val="en-US"/>
+        </w:rPr>
+        <w:t xml:space="preserve"> </w:t>
+      </w:r>
+      <w:proofErr w:type="spellStart"/>
+      <w:r>
+        <w:rPr>
+          <w:lang w:val="en-US"/>
+        </w:rPr>
+        <w:t>originales</w:t>
+      </w:r>
+      <w:proofErr w:type="spellEnd"/>
+      <w:r>
+        <w:rPr>
+          <w:lang w:val="en-US"/>
+        </w:rPr>
+        <w:t xml:space="preserve">, se </w:t>
+      </w:r>
+      <w:proofErr w:type="spellStart"/>
+      <w:r>
+        <w:rPr>
+          <w:lang w:val="en-US"/>
+        </w:rPr>
+        <w:t>seleccionaron</w:t>
+      </w:r>
+      <w:proofErr w:type="spellEnd"/>
+      <w:r>
+        <w:rPr>
+          <w:lang w:val="en-US"/>
+        </w:rPr>
+        <w:t xml:space="preserve"> </w:t>
+      </w:r>
+      <w:proofErr w:type="spellStart"/>
+      <w:r>
+        <w:rPr>
+          <w:lang w:val="en-US"/>
+        </w:rPr>
+        <w:t>aleatoriamente</w:t>
+      </w:r>
+      <w:proofErr w:type="spellEnd"/>
+      <w:r>
+        <w:rPr>
+          <w:lang w:val="en-US"/>
+        </w:rPr>
+        <w:t xml:space="preserve"> 700 </w:t>
+      </w:r>
+      <w:proofErr w:type="spellStart"/>
+      <w:r>
+        <w:rPr>
+          <w:lang w:val="en-US"/>
+        </w:rPr>
+        <w:t>imágenes</w:t>
+      </w:r>
+      <w:proofErr w:type="spellEnd"/>
+      <w:r>
+        <w:rPr>
+          <w:lang w:val="en-US"/>
+        </w:rPr>
+        <w:t xml:space="preserve"> de </w:t>
+      </w:r>
+      <w:proofErr w:type="spellStart"/>
+      <w:r>
+        <w:rPr>
+          <w:lang w:val="en-US"/>
+        </w:rPr>
+        <w:t>cada</w:t>
+      </w:r>
+      <w:proofErr w:type="spellEnd"/>
+      <w:r>
+        <w:rPr>
+          <w:lang w:val="en-US"/>
+        </w:rPr>
+        <w:t xml:space="preserve"> </w:t>
+      </w:r>
+      <w:proofErr w:type="spellStart"/>
+      <w:r>
+        <w:rPr>
+          <w:lang w:val="en-US"/>
+        </w:rPr>
+        <w:t>clase</w:t>
+      </w:r>
+      <w:proofErr w:type="spellEnd"/>
+      <w:r>
+        <w:rPr>
+          <w:lang w:val="en-US"/>
+        </w:rPr>
+        <w:t xml:space="preserve">. La </w:t>
+      </w:r>
+      <w:proofErr w:type="spellStart"/>
+      <w:r>
+        <w:rPr>
+          <w:lang w:val="en-US"/>
+        </w:rPr>
+        <w:t>selección</w:t>
+      </w:r>
+      <w:proofErr w:type="spellEnd"/>
+      <w:r>
+        <w:rPr>
+          <w:lang w:val="en-US"/>
+        </w:rPr>
+        <w:t xml:space="preserve"> se </w:t>
+      </w:r>
+      <w:proofErr w:type="spellStart"/>
+      <w:r>
+        <w:rPr>
+          <w:lang w:val="en-US"/>
+        </w:rPr>
+        <w:t>realizó</w:t>
+      </w:r>
+      <w:proofErr w:type="spellEnd"/>
+      <w:r>
+        <w:rPr>
+          <w:lang w:val="en-US"/>
+        </w:rPr>
+        <w:t xml:space="preserve"> </w:t>
+      </w:r>
+      <w:proofErr w:type="spellStart"/>
+      <w:r>
+        <w:rPr>
+          <w:lang w:val="en-US"/>
+        </w:rPr>
+        <w:t>utilizando</w:t>
+      </w:r>
+      <w:proofErr w:type="spellEnd"/>
+      <w:r>
+        <w:rPr>
+          <w:lang w:val="en-US"/>
+        </w:rPr>
+        <w:t xml:space="preserve"> </w:t>
+      </w:r>
+      <w:proofErr w:type="spellStart"/>
+      <w:r>
+        <w:rPr>
+          <w:lang w:val="en-US"/>
+        </w:rPr>
+        <w:t>una</w:t>
+      </w:r>
+      <w:proofErr w:type="spellEnd"/>
+      <w:r>
+        <w:rPr>
+          <w:lang w:val="en-US"/>
+        </w:rPr>
+        <w:t xml:space="preserve"> </w:t>
+      </w:r>
+      <w:proofErr w:type="spellStart"/>
+      <w:r>
+        <w:rPr>
+          <w:lang w:val="en-US"/>
+        </w:rPr>
+        <w:t>semilla</w:t>
+      </w:r>
+      <w:proofErr w:type="spellEnd"/>
+      <w:r>
+        <w:rPr>
+          <w:lang w:val="en-US"/>
+        </w:rPr>
+        <w:t xml:space="preserve"> </w:t>
+      </w:r>
+      <w:proofErr w:type="spellStart"/>
+      <w:r>
+        <w:rPr>
+          <w:lang w:val="en-US"/>
+        </w:rPr>
+        <w:t>fija</w:t>
+      </w:r>
+      <w:proofErr w:type="spellEnd"/>
+      <w:r>
+        <w:rPr>
+          <w:lang w:val="en-US"/>
+        </w:rPr>
+        <w:t xml:space="preserve">, lo </w:t>
+      </w:r>
+      <w:proofErr w:type="spellStart"/>
+      <w:r>
+        <w:rPr>
+          <w:lang w:val="en-US"/>
+        </w:rPr>
+        <w:t>que</w:t>
+      </w:r>
+      <w:proofErr w:type="spellEnd"/>
+      <w:r>
+        <w:rPr>
+          <w:lang w:val="en-US"/>
+        </w:rPr>
+        <w:t xml:space="preserve"> </w:t>
+      </w:r>
+      <w:proofErr w:type="spellStart"/>
+      <w:r>
+        <w:rPr>
+          <w:lang w:val="en-US"/>
+        </w:rPr>
+        <w:t>permite</w:t>
+      </w:r>
+      <w:proofErr w:type="spellEnd"/>
+      <w:r>
+        <w:rPr>
+          <w:lang w:val="en-US"/>
+        </w:rPr>
+        <w:t xml:space="preserve"> </w:t>
+      </w:r>
+      <w:proofErr w:type="spellStart"/>
+      <w:r>
+        <w:rPr>
+          <w:lang w:val="en-US"/>
+        </w:rPr>
+        <w:t>reproducir</w:t>
+      </w:r>
+      <w:proofErr w:type="spellEnd"/>
+      <w:r>
+        <w:rPr>
+          <w:lang w:val="en-US"/>
+        </w:rPr>
+        <w:t xml:space="preserve"> el </w:t>
+      </w:r>
+      <w:proofErr w:type="spellStart"/>
+      <w:r>
+        <w:rPr>
+          <w:lang w:val="en-US"/>
+        </w:rPr>
+        <w:t>mismo</w:t>
+      </w:r>
+      <w:proofErr w:type="spellEnd"/>
+      <w:r>
+        <w:rPr>
+          <w:lang w:val="en-US"/>
+        </w:rPr>
+        <w:t xml:space="preserve"> </w:t>
+      </w:r>
+      <w:proofErr w:type="spellStart"/>
+      <w:r>
+        <w:rPr>
+          <w:lang w:val="en-US"/>
+        </w:rPr>
+        <w:t>submuestreo</w:t>
+      </w:r>
+      <w:proofErr w:type="spellEnd"/>
+      <w:r>
+        <w:rPr>
+          <w:lang w:val="en-US"/>
+        </w:rPr>
+        <w:t xml:space="preserve">. Al </w:t>
+      </w:r>
+      <w:proofErr w:type="spellStart"/>
+      <w:r>
+        <w:rPr>
+          <w:lang w:val="en-US"/>
+        </w:rPr>
+        <w:t>conservar</w:t>
+      </w:r>
+      <w:proofErr w:type="spellEnd"/>
+      <w:r>
+        <w:rPr>
+          <w:lang w:val="en-US"/>
+        </w:rPr>
+        <w:t xml:space="preserve"> la </w:t>
+      </w:r>
+      <w:proofErr w:type="spellStart"/>
+      <w:r>
+        <w:rPr>
+          <w:lang w:val="en-US"/>
+        </w:rPr>
+        <w:t>misma</w:t>
+      </w:r>
+      <w:proofErr w:type="spellEnd"/>
+      <w:r>
+        <w:rPr>
+          <w:lang w:val="en-US"/>
+        </w:rPr>
+        <w:t xml:space="preserve"> </w:t>
+      </w:r>
+      <w:proofErr w:type="spellStart"/>
+      <w:r>
+        <w:rPr>
+          <w:lang w:val="en-US"/>
+        </w:rPr>
+        <w:t>cantidad</w:t>
+      </w:r>
+      <w:proofErr w:type="spellEnd"/>
+      <w:r>
+        <w:rPr>
+          <w:lang w:val="en-US"/>
+        </w:rPr>
+        <w:t xml:space="preserve"> de </w:t>
+      </w:r>
+      <w:proofErr w:type="spellStart"/>
+      <w:r>
+        <w:rPr>
+          <w:lang w:val="en-US"/>
+        </w:rPr>
+        <w:t>imágenes</w:t>
+      </w:r>
+      <w:proofErr w:type="spellEnd"/>
+      <w:r>
+        <w:rPr>
+          <w:lang w:val="en-US"/>
+        </w:rPr>
+        <w:t xml:space="preserve"> para </w:t>
+      </w:r>
+      <w:proofErr w:type="spellStart"/>
+      <w:r>
+        <w:rPr>
+          <w:lang w:val="en-US"/>
+        </w:rPr>
+        <w:t>cada</w:t>
+      </w:r>
+      <w:proofErr w:type="spellEnd"/>
+      <w:r>
+        <w:rPr>
+          <w:lang w:val="en-US"/>
+        </w:rPr>
+        <w:t xml:space="preserve"> </w:t>
+      </w:r>
+      <w:proofErr w:type="spellStart"/>
+      <w:r>
+        <w:rPr>
+          <w:lang w:val="en-US"/>
+        </w:rPr>
+        <w:t>clase</w:t>
+      </w:r>
+      <w:proofErr w:type="spellEnd"/>
+      <w:r>
+        <w:rPr>
+          <w:lang w:val="en-US"/>
+        </w:rPr>
+        <w:t xml:space="preserve">, el conjunto </w:t>
+      </w:r>
+      <w:proofErr w:type="spellStart"/>
+      <w:r>
+        <w:rPr>
+          <w:lang w:val="en-US"/>
+        </w:rPr>
+        <w:t>reducido</w:t>
+      </w:r>
+      <w:proofErr w:type="spellEnd"/>
+      <w:r>
+        <w:rPr>
+          <w:lang w:val="en-US"/>
+        </w:rPr>
+        <w:t xml:space="preserve"> </w:t>
+      </w:r>
+      <w:proofErr w:type="spellStart"/>
+      <w:r>
+        <w:rPr>
+          <w:lang w:val="en-US"/>
+        </w:rPr>
+        <w:t>continúa</w:t>
+      </w:r>
+      <w:proofErr w:type="spellEnd"/>
+      <w:r>
+        <w:rPr>
+          <w:lang w:val="en-US"/>
+        </w:rPr>
+        <w:t xml:space="preserve"> </w:t>
+      </w:r>
+      <w:proofErr w:type="spellStart"/>
+      <w:r>
+        <w:rPr>
+          <w:lang w:val="en-US"/>
+        </w:rPr>
+        <w:t>balanceado</w:t>
+      </w:r>
+      <w:proofErr w:type="spellEnd"/>
+      <w:r>
+        <w:rPr>
+          <w:lang w:val="en-US"/>
+        </w:rPr>
+        <w:t>.</w:t>
+      </w:r>
+    </w:p>
+    <w:p>
+      <w:pPr>
+        <w:pStyle w:val="Heading2"/>
+        <w:rPr>
+          <w:lang w:val="en-US"/>
+        </w:rPr>
+      </w:pPr>
+      <w:proofErr w:type="spellStart"/>
+      <w:r>
+        <w:rPr>
+          <w:lang w:val="en-US"/>
+        </w:rPr>
+        <w:t>Separación</w:t>
+      </w:r>
+      <w:proofErr w:type="spellEnd"/>
+      <w:r>
+        <w:rPr>
+          <w:lang w:val="en-US"/>
+        </w:rPr>
+        <w:t xml:space="preserve"> de </w:t>
+      </w:r>
+      <w:proofErr w:type="spellStart"/>
+      <w:r>
+        <w:rPr>
+          <w:lang w:val="en-US"/>
+        </w:rPr>
+        <w:t>los</w:t>
+      </w:r>
+      <w:proofErr w:type="spellEnd"/>
+      <w:r>
+        <w:rPr>
+          <w:lang w:val="en-US"/>
+        </w:rPr>
+        <w:t xml:space="preserve"> </w:t>
+      </w:r>
+      <w:proofErr w:type="spellStart"/>
+      <w:r>
+        <w:rPr>
+          <w:lang w:val="en-US"/>
+        </w:rPr>
+        <w:t>datos</w:t>
+      </w:r>
+      <w:proofErr w:type="spellEnd"/>
+    </w:p>
+    <w:p>
+      <w:pPr>
+        <w:rPr>
+          <w:lang w:val="es-US"/>
+        </w:rPr>
+      </w:pPr>
+      <w:r>
+        <w:rPr>
+          <w:lang w:val="es-US"/>
+        </w:rPr>
+        <w:t>Las 700 imágenes seleccionadas de cada clase fueron divididas de manera estratificada en tres conjuntos independientes:</w:t>
+      </w:r>
+    </w:p>
+    <w:tbl>
+      <w:tblPr>
+        <w:tblStyle w:val="PlainTable5"/>
+        <w:tblW w:w="0" w:type="auto"/>
+        <w:tblLook w:val="04A0" w:firstRow="1" w:lastRow="0" w:firstColumn="1" w:lastColumn="0" w:noHBand="0" w:noVBand="1"/>
+      </w:tblPr>
+      <w:tblGrid>
+        <w:gridCol w:w="2942"/>
+        <w:gridCol w:w="2943"/>
+        <w:gridCol w:w="2943"/>
+      </w:tblGrid>
+      <w:tr>
+        <w:trPr>
+          <w:cnfStyle w:val="100000000000" w:firstRow="1" w:lastRow="0" w:firstColumn="0" w:lastColumn="0" w:oddVBand="0" w:evenVBand="0" w:oddHBand="0" w:evenHBand="0" w:firstRowFirstColumn="0" w:firstRowLastColumn="0" w:lastRowFirstColumn="0" w:lastRowLastColumn="0"/>
+        </w:trPr>
+        <w:tc>
+          <w:tcPr>
+            <w:cnfStyle w:val="001000000100" w:firstRow="0" w:lastRow="0" w:firstColumn="1" w:lastColumn="0" w:oddVBand="0" w:evenVBand="0" w:oddHBand="0" w:evenHBand="0" w:firstRowFirstColumn="1" w:firstRowLastColumn="0" w:lastRowFirstColumn="0" w:lastRowLastColumn="0"/>
+            <w:tcW w:w="2942" w:type="dxa"/>
+          </w:tcPr>
+          <w:p>
+            <w:pPr>
+              <w:rPr>
+                <w:lang w:val="es-US"/>
+              </w:rPr>
+            </w:pPr>
+            <w:r>
+              <w:lastRenderedPageBreak/>
+              <w:t>Partición</w:t>
+            </w:r>
+          </w:p>
+        </w:tc>
+        <w:tc>
+          <w:tcPr>
+            <w:tcW w:w="2943" w:type="dxa"/>
+          </w:tcPr>
+          <w:p>
+            <w:pPr>
+              <w:cnfStyle w:val="100000000000" w:firstRow="1" w:lastRow="0" w:firstColumn="0" w:lastColumn="0" w:oddVBand="0" w:evenVBand="0" w:oddHBand="0" w:evenHBand="0" w:firstRowFirstColumn="0" w:firstRowLastColumn="0" w:lastRowFirstColumn="0" w:lastRowLastColumn="0"/>
+              <w:rPr>
+                <w:lang w:val="es-US"/>
+              </w:rPr>
+            </w:pPr>
+            <w:r>
+              <w:t>Imágenes por clase</w:t>
+            </w:r>
+          </w:p>
+        </w:tc>
+        <w:tc>
+          <w:tcPr>
+            <w:tcW w:w="2943" w:type="dxa"/>
+          </w:tcPr>
+          <w:p>
+            <w:pPr>
+              <w:cnfStyle w:val="100000000000" w:firstRow="1" w:lastRow="0" w:firstColumn="0" w:lastColumn="0" w:oddVBand="0" w:evenVBand="0" w:oddHBand="0" w:evenHBand="0" w:firstRowFirstColumn="0" w:firstRowLastColumn="0" w:lastRowFirstColumn="0" w:lastRowLastColumn="0"/>
+              <w:rPr>
+                <w:lang w:val="es-US"/>
+              </w:rPr>
+            </w:pPr>
+            <w:r>
+              <w:t>Total</w:t>
+            </w:r>
+          </w:p>
+        </w:tc>
+      </w:tr>
+      <w:tr>
+        <w:trPr>
+          <w:cnfStyle w:val="000000100000" w:firstRow="0" w:lastRow="0" w:firstColumn="0" w:lastColumn="0" w:oddVBand="0" w:evenVBand="0" w:oddHBand="1" w:evenHBand="0" w:firstRowFirstColumn="0" w:firstRowLastColumn="0" w:lastRowFirstColumn="0" w:lastRowLastColumn="0"/>
+        </w:trPr>
+        <w:tc>
+          <w:tcPr>
+            <w:cnfStyle w:val="001000000000" w:firstRow="0" w:lastRow="0" w:firstColumn="1" w:lastColumn="0" w:oddVBand="0" w:evenVBand="0" w:oddHBand="0" w:evenHBand="0" w:firstRowFirstColumn="0" w:firstRowLastColumn="0" w:lastRowFirstColumn="0" w:lastRowLastColumn="0"/>
+            <w:tcW w:w="2942" w:type="dxa"/>
+          </w:tcPr>
+          <w:p>
+            <w:pPr>
+              <w:rPr>
+                <w:lang w:val="es-US"/>
+              </w:rPr>
+            </w:pPr>
+            <w:r>
+              <w:t>Entrenamiento</w:t>
+            </w:r>
+          </w:p>
+        </w:tc>
+        <w:tc>
+          <w:tcPr>
+            <w:tcW w:w="2943" w:type="dxa"/>
+          </w:tcPr>
+          <w:p>
+            <w:pPr>
+              <w:cnfStyle w:val="000000100000" w:firstRow="0" w:lastRow="0" w:firstColumn="0" w:lastColumn="0" w:oddVBand="0" w:evenVBand="0" w:oddHBand="1" w:evenHBand="0" w:firstRowFirstColumn="0" w:firstRowLastColumn="0" w:lastRowFirstColumn="0" w:lastRowLastColumn="0"/>
+              <w:rPr>
+                <w:lang w:val="es-US"/>
+              </w:rPr>
+            </w:pPr>
+            <w:r>
+              <w:t>500</w:t>
+            </w:r>
+          </w:p>
+        </w:tc>
+        <w:tc>
+          <w:tcPr>
+            <w:tcW w:w="2943" w:type="dxa"/>
+          </w:tcPr>
+          <w:p>
+            <w:pPr>
+              <w:cnfStyle w:val="000000100000" w:firstRow="0" w:lastRow="0" w:firstColumn="0" w:lastColumn="0" w:oddVBand="0" w:evenVBand="0" w:oddHBand="1" w:evenHBand="0" w:firstRowFirstColumn="0" w:firstRowLastColumn="0" w:lastRowFirstColumn="0" w:lastRowLastColumn="0"/>
+              <w:rPr>
+                <w:lang w:val="es-US"/>
+              </w:rPr>
+            </w:pPr>
+            <w:r>
+              <w:t>14,500</w:t>
+            </w:r>
+          </w:p>
+        </w:tc>
+      </w:tr>
+      <w:tr>
+        <w:tc>
+          <w:tcPr>
+            <w:cnfStyle w:val="001000000000" w:firstRow="0" w:lastRow="0" w:firstColumn="1" w:lastColumn="0" w:oddVBand="0" w:evenVBand="0" w:oddHBand="0" w:evenHBand="0" w:firstRowFirstColumn="0" w:firstRowLastColumn="0" w:lastRowFirstColumn="0" w:lastRowLastColumn="0"/>
+            <w:tcW w:w="2942" w:type="dxa"/>
+          </w:tcPr>
+          <w:p>
+            <w:pPr>
+              <w:rPr>
+                <w:lang w:val="es-US"/>
+              </w:rPr>
+            </w:pPr>
+            <w:r>
+              <w:t>Validación</w:t>
+            </w:r>
+          </w:p>
+        </w:tc>
+        <w:tc>
+          <w:tcPr>
+            <w:tcW w:w="2943" w:type="dxa"/>
+          </w:tcPr>
+          <w:p>
+            <w:pPr>
+              <w:cnfStyle w:val="000000000000" w:firstRow="0" w:lastRow="0" w:firstColumn="0" w:lastColumn="0" w:oddVBand="0" w:evenVBand="0" w:oddHBand="0" w:evenHBand="0" w:firstRowFirstColumn="0" w:firstRowLastColumn="0" w:lastRowFirstColumn="0" w:lastRowLastColumn="0"/>
+              <w:rPr>
+                <w:lang w:val="es-US"/>
+              </w:rPr>
+            </w:pPr>
+            <w:r>
+              <w:t>100</w:t>
+            </w:r>
+          </w:p>
+        </w:tc>
+        <w:tc>
+          <w:tcPr>
+            <w:tcW w:w="2943" w:type="dxa"/>
+          </w:tcPr>
+          <w:p>
+            <w:pPr>
+              <w:cnfStyle w:val="000000000000" w:firstRow="0" w:lastRow="0" w:firstColumn="0" w:lastColumn="0" w:oddVBand="0" w:evenVBand="0" w:oddHBand="0" w:evenHBand="0" w:firstRowFirstColumn="0" w:firstRowLastColumn="0" w:lastRowFirstColumn="0" w:lastRowLastColumn="0"/>
+              <w:rPr>
+                <w:lang w:val="es-US"/>
+              </w:rPr>
+            </w:pPr>
+            <w:r>
+              <w:t>2,900</w:t>
+            </w:r>
+          </w:p>
+        </w:tc>
+      </w:tr>
+      <w:tr>
+        <w:trPr>
+          <w:cnfStyle w:val="000000100000" w:firstRow="0" w:lastRow="0" w:firstColumn="0" w:lastColumn="0" w:oddVBand="0" w:evenVBand="0" w:oddHBand="1" w:evenHBand="0" w:firstRowFirstColumn="0" w:firstRowLastColumn="0" w:lastRowFirstColumn="0" w:lastRowLastColumn="0"/>
+        </w:trPr>
+        <w:tc>
+          <w:tcPr>
+            <w:cnfStyle w:val="001000000000" w:firstRow="0" w:lastRow="0" w:firstColumn="1" w:lastColumn="0" w:oddVBand="0" w:evenVBand="0" w:oddHBand="0" w:evenHBand="0" w:firstRowFirstColumn="0" w:firstRowLastColumn="0" w:lastRowFirstColumn="0" w:lastRowLastColumn="0"/>
+            <w:tcW w:w="2942" w:type="dxa"/>
+          </w:tcPr>
+          <w:p>
+            <w:pPr>
+              <w:rPr>
+                <w:lang w:val="es-US"/>
+              </w:rPr>
+            </w:pPr>
+            <w:proofErr w:type="gramStart"/>
+            <w:r>
+              <w:t>Prueba propio</w:t>
+            </w:r>
+            <w:proofErr w:type="gramEnd"/>
+          </w:p>
+        </w:tc>
+        <w:tc>
+          <w:tcPr>
+            <w:tcW w:w="2943" w:type="dxa"/>
+          </w:tcPr>
+          <w:p>
+            <w:pPr>
+              <w:cnfStyle w:val="000000100000" w:firstRow="0" w:lastRow="0" w:firstColumn="0" w:lastColumn="0" w:oddVBand="0" w:evenVBand="0" w:oddHBand="1" w:evenHBand="0" w:firstRowFirstColumn="0" w:firstRowLastColumn="0" w:lastRowFirstColumn="0" w:lastRowLastColumn="0"/>
+              <w:rPr>
+                <w:lang w:val="es-US"/>
+              </w:rPr>
+            </w:pPr>
+            <w:r>
+              <w:t>100</w:t>
+            </w:r>
+          </w:p>
+        </w:tc>
+        <w:tc>
+          <w:tcPr>
+            <w:tcW w:w="2943" w:type="dxa"/>
+          </w:tcPr>
+          <w:p>
+            <w:pPr>
+              <w:cnfStyle w:val="000000100000" w:firstRow="0" w:lastRow="0" w:firstColumn="0" w:lastColumn="0" w:oddVBand="0" w:evenVBand="0" w:oddHBand="1" w:evenHBand="0" w:firstRowFirstColumn="0" w:firstRowLastColumn="0" w:lastRowFirstColumn="0" w:lastRowLastColumn="0"/>
+              <w:rPr>
+                <w:lang w:val="es-US"/>
+              </w:rPr>
+            </w:pPr>
+            <w:r>
+              <w:t>2,900</w:t>
+            </w:r>
+          </w:p>
+        </w:tc>
+      </w:tr>
+    </w:tbl>
+    <w:p>
+      <w:pPr>
+        <w:rPr>
+          <w:lang w:val="es-US"/>
+        </w:rPr>
+      </w:pPr>
+    </w:p>
     <w:p>
       <w:pPr>
         <w:pStyle w:val="Heading1"/>
-      </w:pPr>
-      <w:r>
-        <w:t>Primera Parte:</w:t>
-      </w:r>
-    </w:p>
-    <w:p/>
+        <w:rPr>
+          <w:lang w:val="es-US"/>
+        </w:rPr>
+      </w:pPr>
+      <w:r>
+        <w:rPr>
+          <w:lang w:val="es-US"/>
+        </w:rPr>
+        <w:t>Selección de Modelos</w:t>
+      </w:r>
+    </w:p>
+    <w:p>
+      <w:pPr>
+        <w:rPr>
+          <w:lang w:val="es-US"/>
+        </w:rPr>
+      </w:pPr>
+    </w:p>
+    <w:p>
+      <w:pPr>
+        <w:rPr>
+          <w:lang w:val="es-US"/>
+        </w:rPr>
+      </w:pPr>
+      <w:r>
+        <w:rPr>
+          <w:rStyle w:val="SubtitleChar"/>
+          <w:lang w:val="es-US"/>
+        </w:rPr>
+        <w:t>Red Neuronal Simple</w:t>
+      </w:r>
+      <w:r>
+        <w:rPr>
+          <w:lang w:val="es-US"/>
+        </w:rPr>
+        <w:t>.</w:t>
+      </w:r>
+    </w:p>
+    <w:p>
+      <w:pPr>
+        <w:rPr>
+          <w:lang w:val="es-US"/>
+        </w:rPr>
+      </w:pPr>
+      <w:r>
+        <w:rPr>
+          <w:lang w:val="es-US"/>
+        </w:rPr>
+        <w:t>Se requiere un modelo con una red neuronal simple, el cuál procedería como sigue:</w:t>
+      </w:r>
+    </w:p>
+    <w:p>
+      <w:pPr>
+        <w:pStyle w:val="ListParagraph"/>
+        <w:numPr>
+          <w:ilvl w:val="0"/>
+          <w:numId w:val="3"/>
+        </w:numPr>
+        <w:rPr>
+          <w:lang w:val="es-US"/>
+        </w:rPr>
+      </w:pPr>
+      <w:r>
+        <w:rPr>
+          <w:lang w:val="es-US"/>
+        </w:rPr>
+        <w:t xml:space="preserve">A las imágenes, que poseen cerca de 12,288 valores, se les aplica primeramente Flatten. </w:t>
+      </w:r>
+    </w:p>
+    <w:p>
+      <w:pPr>
+        <w:pStyle w:val="ListParagraph"/>
+        <w:numPr>
+          <w:ilvl w:val="0"/>
+          <w:numId w:val="3"/>
+        </w:numPr>
+        <w:rPr>
+          <w:lang w:val="es-US"/>
+        </w:rPr>
+      </w:pPr>
+      <w:r>
+        <w:rPr>
+          <w:lang w:val="es-US"/>
+        </w:rPr>
+        <w:t xml:space="preserve">Se procederá a aplicarle una capa lineal, el cuál dará como salida 512 valores. </w:t>
+      </w:r>
+    </w:p>
+    <w:p>
+      <w:pPr>
+        <w:pStyle w:val="ListParagraph"/>
+        <w:numPr>
+          <w:ilvl w:val="0"/>
+          <w:numId w:val="3"/>
+        </w:numPr>
+        <w:rPr>
+          <w:lang w:val="es-US"/>
+        </w:rPr>
+      </w:pPr>
+      <w:r>
+        <w:rPr>
+          <w:lang w:val="es-US"/>
+        </w:rPr>
+        <w:t xml:space="preserve">Se proseguirá a aplicar el </w:t>
+      </w:r>
+      <w:proofErr w:type="spellStart"/>
+      <w:r>
+        <w:rPr>
+          <w:lang w:val="es-US"/>
+        </w:rPr>
+        <w:t>ReLU</w:t>
+      </w:r>
+      <w:proofErr w:type="spellEnd"/>
+      <w:r>
+        <w:rPr>
+          <w:lang w:val="es-US"/>
+        </w:rPr>
+        <w:t xml:space="preserve">. </w:t>
+      </w:r>
+    </w:p>
+    <w:p>
+      <w:pPr>
+        <w:pStyle w:val="ListParagraph"/>
+        <w:numPr>
+          <w:ilvl w:val="0"/>
+          <w:numId w:val="3"/>
+        </w:numPr>
+        <w:rPr>
+          <w:lang w:val="es-US"/>
+        </w:rPr>
+      </w:pPr>
+      <w:r>
+        <w:rPr>
+          <w:lang w:val="es-US"/>
+        </w:rPr>
+        <w:t xml:space="preserve">Se sigue a aplicar </w:t>
+      </w:r>
+      <w:proofErr w:type="spellStart"/>
+      <w:r>
+        <w:rPr>
+          <w:lang w:val="es-US"/>
+        </w:rPr>
+        <w:t>Dropout</w:t>
+      </w:r>
+      <w:proofErr w:type="spellEnd"/>
+      <w:r>
+        <w:rPr>
+          <w:lang w:val="es-US"/>
+        </w:rPr>
+        <w:t>.</w:t>
+      </w:r>
+    </w:p>
+    <w:p>
+      <w:pPr>
+        <w:pStyle w:val="ListParagraph"/>
+        <w:numPr>
+          <w:ilvl w:val="0"/>
+          <w:numId w:val="3"/>
+        </w:numPr>
+        <w:rPr>
+          <w:lang w:val="es-US"/>
+        </w:rPr>
+      </w:pPr>
+      <w:r>
+        <w:rPr>
+          <w:lang w:val="es-US"/>
+        </w:rPr>
+        <w:t>Se llegará a aplicar nuevamente una capa lineal que reciba los 512 valores y devuelva 128 valores.</w:t>
+      </w:r>
+    </w:p>
+    <w:p>
+      <w:pPr>
+        <w:pStyle w:val="ListParagraph"/>
+        <w:numPr>
+          <w:ilvl w:val="0"/>
+          <w:numId w:val="3"/>
+        </w:numPr>
+        <w:rPr>
+          <w:lang w:val="es-US"/>
+        </w:rPr>
+      </w:pPr>
+      <w:r>
+        <w:rPr>
+          <w:lang w:val="es-US"/>
+        </w:rPr>
+        <w:t xml:space="preserve">A este resultado se le procederá a aplicar nuevamente el </w:t>
+      </w:r>
+      <w:proofErr w:type="spellStart"/>
+      <w:r>
+        <w:rPr>
+          <w:lang w:val="es-US"/>
+        </w:rPr>
+        <w:t>ReLU</w:t>
+      </w:r>
+      <w:proofErr w:type="spellEnd"/>
+      <w:r>
+        <w:rPr>
+          <w:lang w:val="es-US"/>
+        </w:rPr>
+        <w:t>.</w:t>
+      </w:r>
+    </w:p>
+    <w:p>
+      <w:pPr>
+        <w:pStyle w:val="ListParagraph"/>
+        <w:numPr>
+          <w:ilvl w:val="0"/>
+          <w:numId w:val="3"/>
+        </w:numPr>
+        <w:rPr>
+          <w:lang w:val="es-US"/>
+        </w:rPr>
+      </w:pPr>
+      <w:r>
+        <w:rPr>
+          <w:lang w:val="es-US"/>
+        </w:rPr>
+        <w:t xml:space="preserve">Por último, se le aplicará una capa lineal que reciba los 128 valores y devuelva 29. </w:t>
+      </w:r>
+    </w:p>
+    <w:p>
+      <w:pPr>
+        <w:pStyle w:val="Subtitle"/>
+        <w:rPr>
+          <w:lang w:val="es-US"/>
+        </w:rPr>
+      </w:pPr>
+      <w:r>
+        <w:rPr>
+          <w:lang w:val="es-US"/>
+        </w:rPr>
+        <w:t>CNN simple</w:t>
+      </w:r>
+    </w:p>
+    <w:p>
+      <w:pPr>
+        <w:pStyle w:val="ListParagraph"/>
+        <w:numPr>
+          <w:ilvl w:val="0"/>
+          <w:numId w:val="4"/>
+        </w:numPr>
+        <w:rPr>
+          <w:lang w:val="es-US"/>
+        </w:rPr>
+      </w:pPr>
+      <w:r>
+        <w:rPr>
+          <w:lang w:val="es-US"/>
+        </w:rPr>
+        <w:t>En este caso se aplica la primera convolución con tres canales de entrada con un volumen de salida de 16 características tras aplicar 16 filtros distintos.</w:t>
+      </w:r>
+    </w:p>
+    <w:p>
+      <w:pPr>
+        <w:pStyle w:val="ListParagraph"/>
+        <w:numPr>
+          <w:ilvl w:val="0"/>
+          <w:numId w:val="4"/>
+        </w:numPr>
+        <w:rPr>
+          <w:lang w:val="es-US"/>
+        </w:rPr>
+      </w:pPr>
+      <w:r>
+        <w:rPr>
+          <w:lang w:val="es-US"/>
+        </w:rPr>
+        <w:t xml:space="preserve">Se aplica </w:t>
+      </w:r>
+      <w:proofErr w:type="spellStart"/>
+      <w:r>
+        <w:rPr>
+          <w:lang w:val="es-US"/>
+        </w:rPr>
+        <w:t>ReLU</w:t>
+      </w:r>
+      <w:proofErr w:type="spellEnd"/>
+    </w:p>
+    <w:p>
+      <w:pPr>
+        <w:pStyle w:val="ListParagraph"/>
+        <w:numPr>
+          <w:ilvl w:val="0"/>
+          <w:numId w:val="4"/>
+        </w:numPr>
+        <w:rPr>
+          <w:lang w:val="es-US"/>
+        </w:rPr>
+      </w:pPr>
+      <w:r>
+        <w:rPr>
+          <w:lang w:val="es-US"/>
+        </w:rPr>
+        <w:t xml:space="preserve">Se aplica </w:t>
+      </w:r>
+      <w:proofErr w:type="spellStart"/>
+      <w:r>
+        <w:rPr>
+          <w:lang w:val="es-US"/>
+        </w:rPr>
+        <w:t>MaxPool</w:t>
+      </w:r>
+      <w:proofErr w:type="spellEnd"/>
+    </w:p>
+    <w:p>
+      <w:pPr>
+        <w:pStyle w:val="ListParagraph"/>
+        <w:numPr>
+          <w:ilvl w:val="0"/>
+          <w:numId w:val="4"/>
+        </w:numPr>
+        <w:rPr>
+          <w:lang w:val="es-US"/>
+        </w:rPr>
+      </w:pPr>
+      <w:r>
+        <w:rPr>
+          <w:lang w:val="es-US"/>
+        </w:rPr>
+        <w:t>Se aplica una segunda convolución a las 16 características que devolverá 32 características.</w:t>
+      </w:r>
+    </w:p>
+    <w:p>
+      <w:pPr>
+        <w:pStyle w:val="ListParagraph"/>
+        <w:numPr>
+          <w:ilvl w:val="0"/>
+          <w:numId w:val="4"/>
+        </w:numPr>
+        <w:rPr>
+          <w:lang w:val="es-US"/>
+        </w:rPr>
+      </w:pPr>
+      <w:r>
+        <w:rPr>
+          <w:lang w:val="es-US"/>
+        </w:rPr>
+        <w:t xml:space="preserve">Se aplica </w:t>
+      </w:r>
+      <w:proofErr w:type="spellStart"/>
+      <w:r>
+        <w:rPr>
+          <w:lang w:val="es-US"/>
+        </w:rPr>
+        <w:t>ReLU</w:t>
+      </w:r>
+      <w:proofErr w:type="spellEnd"/>
+      <w:r>
+        <w:rPr>
+          <w:lang w:val="es-US"/>
+        </w:rPr>
+        <w:t xml:space="preserve"> nuevamente</w:t>
+      </w:r>
+    </w:p>
+    <w:p>
+      <w:pPr>
+        <w:pStyle w:val="ListParagraph"/>
+        <w:numPr>
+          <w:ilvl w:val="0"/>
+          <w:numId w:val="4"/>
+        </w:numPr>
+        <w:rPr>
+          <w:lang w:val="es-US"/>
+        </w:rPr>
+      </w:pPr>
+      <w:r>
+        <w:rPr>
+          <w:lang w:val="es-US"/>
+        </w:rPr>
+        <w:t xml:space="preserve">Aplicación de </w:t>
+      </w:r>
+      <w:proofErr w:type="spellStart"/>
+      <w:r>
+        <w:rPr>
+          <w:lang w:val="es-US"/>
+        </w:rPr>
+        <w:t>MaxPool</w:t>
+      </w:r>
+      <w:proofErr w:type="spellEnd"/>
+    </w:p>
+    <w:p>
+      <w:pPr>
+        <w:pStyle w:val="ListParagraph"/>
+        <w:numPr>
+          <w:ilvl w:val="0"/>
+          <w:numId w:val="4"/>
+        </w:numPr>
+        <w:rPr>
+          <w:lang w:val="es-US"/>
+        </w:rPr>
+      </w:pPr>
+      <w:r>
+        <w:rPr>
+          <w:lang w:val="es-US"/>
+        </w:rPr>
+        <w:t>Tercera convolución sobre los 32 anteriores, con salida de 64 valores.</w:t>
+      </w:r>
+    </w:p>
+    <w:p>
+      <w:pPr>
+        <w:pStyle w:val="ListParagraph"/>
+        <w:numPr>
+          <w:ilvl w:val="0"/>
+          <w:numId w:val="4"/>
+        </w:numPr>
+        <w:rPr>
+          <w:lang w:val="es-US"/>
+        </w:rPr>
+      </w:pPr>
+      <w:r>
+        <w:rPr>
+          <w:lang w:val="es-US"/>
+        </w:rPr>
+        <w:t xml:space="preserve">Aplicación de </w:t>
+      </w:r>
+      <w:proofErr w:type="spellStart"/>
+      <w:r>
+        <w:rPr>
+          <w:lang w:val="es-US"/>
+        </w:rPr>
+        <w:t>ReLU</w:t>
+      </w:r>
+      <w:proofErr w:type="spellEnd"/>
+    </w:p>
+    <w:p>
+      <w:pPr>
+        <w:pStyle w:val="ListParagraph"/>
+        <w:numPr>
+          <w:ilvl w:val="0"/>
+          <w:numId w:val="4"/>
+        </w:numPr>
+        <w:rPr>
+          <w:lang w:val="es-US"/>
+        </w:rPr>
+      </w:pPr>
+      <w:r>
+        <w:rPr>
+          <w:lang w:val="es-US"/>
+        </w:rPr>
+        <w:t xml:space="preserve">Aplicación de </w:t>
+      </w:r>
+      <w:proofErr w:type="spellStart"/>
+      <w:r>
+        <w:rPr>
+          <w:lang w:val="es-US"/>
+        </w:rPr>
+        <w:t>MaxPool</w:t>
+      </w:r>
+      <w:proofErr w:type="spellEnd"/>
+    </w:p>
+    <w:p>
+      <w:pPr>
+        <w:pStyle w:val="ListParagraph"/>
+        <w:numPr>
+          <w:ilvl w:val="0"/>
+          <w:numId w:val="4"/>
+        </w:numPr>
+        <w:rPr>
+          <w:lang w:val="es-US"/>
+        </w:rPr>
+      </w:pPr>
+      <w:r>
+        <w:rPr>
+          <w:lang w:val="es-US"/>
+        </w:rPr>
+        <w:t>Se aplica un Flatten</w:t>
+      </w:r>
+    </w:p>
+    <w:p>
+      <w:pPr>
+        <w:pStyle w:val="ListParagraph"/>
+        <w:numPr>
+          <w:ilvl w:val="0"/>
+          <w:numId w:val="4"/>
+        </w:numPr>
+        <w:rPr>
+          <w:lang w:val="es-US"/>
+        </w:rPr>
+      </w:pPr>
+      <w:r>
+        <w:rPr>
+          <w:lang w:val="es-US"/>
+        </w:rPr>
+        <w:t>Aplicación de una capa lineal</w:t>
+      </w:r>
+    </w:p>
+    <w:p>
+      <w:pPr>
+        <w:pStyle w:val="ListParagraph"/>
+        <w:numPr>
+          <w:ilvl w:val="0"/>
+          <w:numId w:val="4"/>
+        </w:numPr>
+        <w:rPr>
+          <w:lang w:val="es-US"/>
+        </w:rPr>
+      </w:pPr>
+      <w:r>
+        <w:rPr>
+          <w:lang w:val="es-US"/>
+        </w:rPr>
+        <w:t>Retorno de 29 clases</w:t>
+      </w:r>
+    </w:p>
+    <w:p>
+      <w:pPr>
+        <w:pStyle w:val="Subtitle"/>
+        <w:rPr>
+          <w:lang w:val="es-US"/>
+        </w:rPr>
+      </w:pPr>
+      <w:r>
+        <w:rPr>
+          <w:lang w:val="es-US"/>
+        </w:rPr>
+        <w:lastRenderedPageBreak/>
+        <w:t>Segunda CNN</w:t>
+      </w:r>
+    </w:p>
+    <w:p>
+      <w:pPr>
+        <w:pStyle w:val="ListParagraph"/>
+        <w:numPr>
+          <w:ilvl w:val="0"/>
+          <w:numId w:val="5"/>
+        </w:numPr>
+        <w:rPr>
+          <w:lang w:val="es-US"/>
+        </w:rPr>
+      </w:pPr>
+      <w:r>
+        <w:rPr>
+          <w:lang w:val="es-US"/>
+        </w:rPr>
+        <w:t>Se aplica una convolución que recibe los 3 canales y retorna 32 características</w:t>
+      </w:r>
+    </w:p>
+    <w:p>
+      <w:pPr>
+        <w:pStyle w:val="ListParagraph"/>
+        <w:numPr>
+          <w:ilvl w:val="0"/>
+          <w:numId w:val="5"/>
+        </w:numPr>
+        <w:rPr>
+          <w:lang w:val="es-US"/>
+        </w:rPr>
+      </w:pPr>
+      <w:r>
+        <w:rPr>
+          <w:lang w:val="es-US"/>
+        </w:rPr>
+        <w:t xml:space="preserve">A este se le aplica un </w:t>
+      </w:r>
+      <w:proofErr w:type="spellStart"/>
+      <w:r>
+        <w:rPr>
+          <w:lang w:val="es-US"/>
+        </w:rPr>
+        <w:t>BatchNorm</w:t>
+      </w:r>
+      <w:proofErr w:type="spellEnd"/>
+    </w:p>
+    <w:p>
+      <w:pPr>
+        <w:pStyle w:val="ListParagraph"/>
+        <w:numPr>
+          <w:ilvl w:val="0"/>
+          <w:numId w:val="5"/>
+        </w:numPr>
+        <w:rPr>
+          <w:lang w:val="es-US"/>
+        </w:rPr>
+      </w:pPr>
+      <w:r>
+        <w:rPr>
+          <w:lang w:val="es-US"/>
+        </w:rPr>
+        <w:t xml:space="preserve">Se procede a aplicar </w:t>
+      </w:r>
+      <w:proofErr w:type="spellStart"/>
+      <w:r>
+        <w:rPr>
+          <w:lang w:val="es-US"/>
+        </w:rPr>
+        <w:t>ReLU</w:t>
+      </w:r>
+      <w:proofErr w:type="spellEnd"/>
+    </w:p>
+    <w:p>
+      <w:pPr>
+        <w:pStyle w:val="ListParagraph"/>
+        <w:numPr>
+          <w:ilvl w:val="0"/>
+          <w:numId w:val="5"/>
+        </w:numPr>
+        <w:rPr>
+          <w:lang w:val="es-US"/>
+        </w:rPr>
+      </w:pPr>
+      <w:r>
+        <w:rPr>
+          <w:lang w:val="es-US"/>
+        </w:rPr>
+        <w:t xml:space="preserve">Se aplica </w:t>
+      </w:r>
+      <w:proofErr w:type="spellStart"/>
+      <w:r>
+        <w:rPr>
+          <w:lang w:val="es-US"/>
+        </w:rPr>
+        <w:t>MaxPool</w:t>
+      </w:r>
+      <w:proofErr w:type="spellEnd"/>
+    </w:p>
+    <w:p>
+      <w:pPr>
+        <w:pStyle w:val="ListParagraph"/>
+        <w:numPr>
+          <w:ilvl w:val="0"/>
+          <w:numId w:val="5"/>
+        </w:numPr>
+        <w:rPr>
+          <w:lang w:val="es-US"/>
+        </w:rPr>
+      </w:pPr>
+      <w:r>
+        <w:rPr>
+          <w:lang w:val="es-US"/>
+        </w:rPr>
+        <w:t>Segunda convolución que recibe los 32 valores de la primera y devuelve 64.</w:t>
+      </w:r>
+    </w:p>
+    <w:p>
+      <w:pPr>
+        <w:pStyle w:val="ListParagraph"/>
+        <w:numPr>
+          <w:ilvl w:val="0"/>
+          <w:numId w:val="5"/>
+        </w:numPr>
+        <w:rPr>
+          <w:lang w:val="es-US"/>
+        </w:rPr>
+      </w:pPr>
+      <w:r>
+        <w:rPr>
+          <w:lang w:val="es-US"/>
+        </w:rPr>
+        <w:t xml:space="preserve">A este se le aplica un </w:t>
+      </w:r>
+      <w:proofErr w:type="spellStart"/>
+      <w:r>
+        <w:rPr>
+          <w:lang w:val="es-US"/>
+        </w:rPr>
+        <w:t>BatchNorm</w:t>
+      </w:r>
+      <w:proofErr w:type="spellEnd"/>
+    </w:p>
+    <w:p>
+      <w:pPr>
+        <w:pStyle w:val="ListParagraph"/>
+        <w:numPr>
+          <w:ilvl w:val="0"/>
+          <w:numId w:val="5"/>
+        </w:numPr>
+        <w:rPr>
+          <w:lang w:val="es-US"/>
+        </w:rPr>
+      </w:pPr>
+      <w:r>
+        <w:rPr>
+          <w:lang w:val="es-US"/>
+        </w:rPr>
+        <w:t xml:space="preserve">Se procede a aplicar </w:t>
+      </w:r>
+      <w:proofErr w:type="spellStart"/>
+      <w:r>
+        <w:rPr>
+          <w:lang w:val="es-US"/>
+        </w:rPr>
+        <w:t>ReLU</w:t>
+      </w:r>
+      <w:proofErr w:type="spellEnd"/>
+    </w:p>
+    <w:p>
+      <w:pPr>
+        <w:pStyle w:val="ListParagraph"/>
+        <w:numPr>
+          <w:ilvl w:val="0"/>
+          <w:numId w:val="5"/>
+        </w:numPr>
+        <w:rPr>
+          <w:lang w:val="es-US"/>
+        </w:rPr>
+      </w:pPr>
+      <w:r>
+        <w:rPr>
+          <w:lang w:val="es-US"/>
+        </w:rPr>
+        <w:t xml:space="preserve">Se aplica </w:t>
+      </w:r>
+      <w:proofErr w:type="spellStart"/>
+      <w:r>
+        <w:rPr>
+          <w:lang w:val="es-US"/>
+        </w:rPr>
+        <w:t>MaxPool</w:t>
+      </w:r>
+      <w:proofErr w:type="spellEnd"/>
+    </w:p>
+    <w:p>
+      <w:pPr>
+        <w:pStyle w:val="ListParagraph"/>
+        <w:numPr>
+          <w:ilvl w:val="0"/>
+          <w:numId w:val="5"/>
+        </w:numPr>
+        <w:rPr>
+          <w:lang w:val="es-US"/>
+        </w:rPr>
+      </w:pPr>
+      <w:r>
+        <w:rPr>
+          <w:lang w:val="es-US"/>
+        </w:rPr>
+        <w:t>Tercera convolución que recibe los 64 valores de la segunda y devuelve 128.</w:t>
+      </w:r>
+    </w:p>
+    <w:p>
+      <w:pPr>
+        <w:pStyle w:val="ListParagraph"/>
+        <w:numPr>
+          <w:ilvl w:val="0"/>
+          <w:numId w:val="5"/>
+        </w:numPr>
+        <w:rPr>
+          <w:lang w:val="es-US"/>
+        </w:rPr>
+      </w:pPr>
+      <w:r>
+        <w:rPr>
+          <w:lang w:val="es-US"/>
+        </w:rPr>
+        <w:t xml:space="preserve">Se aplicará un Global </w:t>
+      </w:r>
+      <w:proofErr w:type="spellStart"/>
+      <w:r>
+        <w:rPr>
+          <w:lang w:val="es-US"/>
+        </w:rPr>
+        <w:t>Average</w:t>
+      </w:r>
+      <w:proofErr w:type="spellEnd"/>
+      <w:r>
+        <w:rPr>
+          <w:lang w:val="es-US"/>
+        </w:rPr>
+        <w:t xml:space="preserve"> </w:t>
+      </w:r>
+      <w:proofErr w:type="spellStart"/>
+      <w:r>
+        <w:rPr>
+          <w:lang w:val="es-US"/>
+        </w:rPr>
+        <w:t>Pooling</w:t>
+      </w:r>
+      <w:proofErr w:type="spellEnd"/>
+    </w:p>
+    <w:p>
+      <w:pPr>
+        <w:pStyle w:val="ListParagraph"/>
+        <w:numPr>
+          <w:ilvl w:val="0"/>
+          <w:numId w:val="5"/>
+        </w:numPr>
+        <w:rPr>
+          <w:lang w:val="es-US"/>
+        </w:rPr>
+      </w:pPr>
+      <w:r>
+        <w:rPr>
+          <w:lang w:val="es-US"/>
+        </w:rPr>
+        <w:t>Se aplica Flatten, que devuelve un vector con 128 valores</w:t>
+      </w:r>
+    </w:p>
+    <w:p>
+      <w:pPr>
+        <w:pStyle w:val="ListParagraph"/>
+        <w:numPr>
+          <w:ilvl w:val="0"/>
+          <w:numId w:val="5"/>
+        </w:numPr>
+        <w:rPr>
+          <w:lang w:val="es-US"/>
+        </w:rPr>
+      </w:pPr>
+      <w:r>
+        <w:rPr>
+          <w:lang w:val="es-US"/>
+        </w:rPr>
+        <w:t xml:space="preserve">A este se le aplicará un </w:t>
+      </w:r>
+      <w:proofErr w:type="spellStart"/>
+      <w:r>
+        <w:rPr>
+          <w:lang w:val="es-US"/>
+        </w:rPr>
+        <w:t>Dropout</w:t>
+      </w:r>
+      <w:proofErr w:type="spellEnd"/>
+    </w:p>
+    <w:p>
+      <w:pPr>
+        <w:pStyle w:val="ListParagraph"/>
+        <w:numPr>
+          <w:ilvl w:val="0"/>
+          <w:numId w:val="5"/>
+        </w:numPr>
+        <w:rPr>
+          <w:lang w:val="es-US"/>
+        </w:rPr>
+      </w:pPr>
+      <w:r>
+        <w:rPr>
+          <w:lang w:val="es-US"/>
+        </w:rPr>
+        <w:t>Se aplica una capa lineal</w:t>
+      </w:r>
+    </w:p>
+    <w:p>
+      <w:pPr>
+        <w:pStyle w:val="ListParagraph"/>
+        <w:numPr>
+          <w:ilvl w:val="0"/>
+          <w:numId w:val="5"/>
+        </w:numPr>
+        <w:rPr>
+          <w:lang w:val="es-US"/>
+        </w:rPr>
+      </w:pPr>
+      <w:r>
+        <w:rPr>
+          <w:lang w:val="es-US"/>
+        </w:rPr>
+        <w:t>Retorno de 29 clases</w:t>
+      </w:r>
+    </w:p>
     <w:p>
       <w:pPr>
         <w:pStyle w:val="Heading1"/>
-      </w:pPr>
-      <w:r>
-        <w:t>Series LSTM</w:t>
-      </w:r>
-    </w:p>
-    <w:p/>
-    <w:p/>
+        <w:rPr>
+          <w:lang w:val="es-US"/>
+        </w:rPr>
+      </w:pPr>
+      <w:r>
+        <w:rPr>
+          <w:lang w:val="es-US"/>
+        </w:rPr>
+        <w:t>Plan para procesamiento</w:t>
+      </w:r>
+    </w:p>
+    <w:p>
+      <w:pPr>
+        <w:rPr>
+          <w:lang w:val="es-US"/>
+        </w:rPr>
+      </w:pPr>
+      <w:r>
+        <w:rPr>
+          <w:lang w:val="es-US"/>
+        </w:rPr>
+        <w:t xml:space="preserve">Para la manipulación de las imágenes, se realizará un submuestreo de estas, y tras la separación en entrenamiento y prueba llevado a cabo en esta primera etapa se realizará una disminución de las dimensiones de 200*200 a 64*64. </w:t>
+      </w:r>
+    </w:p>
+    <w:p>
+      <w:pPr>
+        <w:rPr>
+          <w:lang w:val="es-US"/>
+        </w:rPr>
+      </w:pPr>
+      <w:r>
+        <w:rPr>
+          <w:lang w:val="es-US"/>
+        </w:rPr>
+        <w:t xml:space="preserve">Tras este cambio se hará la aplicación de los modelos antes descrita con el conjunto de entrenamiento. Se procederá a la evaluación sobre el conjunto de prueba. Se evaluarán los modelos conforme a las siguientes métricas: </w:t>
+      </w:r>
+      <w:proofErr w:type="spellStart"/>
+      <w:r>
+        <w:rPr>
+          <w:lang w:val="es-US"/>
+        </w:rPr>
+        <w:t>Accuracy</w:t>
+      </w:r>
+      <w:proofErr w:type="spellEnd"/>
+      <w:r>
+        <w:rPr>
+          <w:lang w:val="es-US"/>
+        </w:rPr>
+        <w:t xml:space="preserve">, </w:t>
+      </w:r>
+      <w:proofErr w:type="spellStart"/>
+      <w:r>
+        <w:rPr>
+          <w:lang w:val="es-US"/>
+        </w:rPr>
+        <w:t>Precision</w:t>
+      </w:r>
+      <w:proofErr w:type="spellEnd"/>
+      <w:r>
+        <w:rPr>
+          <w:lang w:val="es-US"/>
+        </w:rPr>
+        <w:t xml:space="preserve">, </w:t>
+      </w:r>
+      <w:proofErr w:type="spellStart"/>
+      <w:r>
+        <w:rPr>
+          <w:lang w:val="es-US"/>
+        </w:rPr>
+        <w:t>Recall</w:t>
+      </w:r>
+      <w:proofErr w:type="spellEnd"/>
+      <w:r>
+        <w:rPr>
+          <w:lang w:val="es-US"/>
+        </w:rPr>
+        <w:t>, F1, Matriz de Confusión y de ser necesario el tiempo de cómputo.</w:t>
+      </w:r>
+    </w:p>
+    <w:p>
+      <w:pPr>
+        <w:rPr>
+          <w:lang w:val="es-US"/>
+        </w:rPr>
+      </w:pPr>
+    </w:p>
+    <w:p>
+      <w:pPr>
+        <w:rPr>
+          <w:lang w:val="es-US"/>
+        </w:rPr>
+      </w:pPr>
+    </w:p>
+    <w:p>
+      <w:pPr>
+        <w:rPr>
+          <w:rFonts w:asciiTheme="majorHAnsi" w:eastAsiaTheme="majorEastAsia" w:hAnsiTheme="majorHAnsi" w:cstheme="majorBidi"/>
+          <w:color w:val="0F4761" w:themeColor="accent1" w:themeShade="BF"/>
+          <w:sz w:val="40"/>
+          <w:szCs w:val="40"/>
+          <w:lang w:val="es-US"/>
+        </w:rPr>
+      </w:pPr>
+      <w:r>
+        <w:rPr>
+          <w:lang w:val="es-US"/>
+        </w:rPr>
+        <w:br w:type="page"/>
+      </w:r>
+    </w:p>
     <w:p>
       <w:pPr>
         <w:pStyle w:val="Heading1"/>
-      </w:pPr>
-      <w:r>
-        <w:t>Segunda Parte</w:t>
-      </w:r>
-    </w:p>
-    <w:p/>
+        <w:rPr>
+          <w:lang w:val="es-US"/>
+        </w:rPr>
+      </w:pPr>
+      <w:r>
+        <w:rPr>
+          <w:lang w:val="es-US"/>
+        </w:rPr>
+        <w:lastRenderedPageBreak/>
+        <w:t>Anexo</w:t>
+      </w:r>
+    </w:p>
     <w:p>
       <w:pPr>
         <w:jc w:val="both"/>
-      </w:pPr>
-    </w:p>
-    <w:p>
-      <w:pPr>
-        <w:pStyle w:val="Heading1"/>
-      </w:pPr>
-      <w:r>
-        <w:t>Anexo</w:t>
-      </w:r>
-    </w:p>
-    <w:p>
-      <w:pPr>
-        <w:jc w:val="both"/>
+        <w:rPr>
+          <w:lang w:val="es-US"/>
+        </w:rPr>
       </w:pPr>
     </w:p>
     <w:p>
@@ -219,6 +2108,7 @@
           <w:szCs w:val="40"/>
           <w:bdr w:val="none" w:sz="0" w:space="0" w:color="auto" w:frame="1"/>
           <w:shd w:val="clear" w:color="auto" w:fill="606060"/>
+          <w:lang w:val="es-US"/>
         </w:rPr>
       </w:pPr>
       <w:r>
@@ -228,7 +2118,7 @@
           <w:color w:val="0F4761"/>
           <w:sz w:val="40"/>
           <w:szCs w:val="40"/>
-          <w:lang w:val="es-ES"/>
+          <w:lang w:val="es-US"/>
         </w:rPr>
         <w:t>Referencias</w:t>
       </w:r>
@@ -241,6 +2131,7 @@
           <w:szCs w:val="40"/>
           <w:bdr w:val="none" w:sz="0" w:space="0" w:color="auto" w:frame="1"/>
           <w:shd w:val="clear" w:color="auto" w:fill="606060"/>
+          <w:lang w:val="es-US"/>
         </w:rPr>
         <w:t> </w:t>
       </w:r>
@@ -256,13 +2147,14 @@
           <w:color w:val="0F4761"/>
           <w:sz w:val="18"/>
           <w:szCs w:val="18"/>
-        </w:rPr>
-      </w:pPr>
-    </w:p>
-    <w:p>
-      <w:pPr>
-        <w:rPr>
-          <w:lang w:val="es-ES"/>
+          <w:lang w:val="es-US"/>
+        </w:rPr>
+      </w:pPr>
+    </w:p>
+    <w:p>
+      <w:pPr>
+        <w:rPr>
+          <w:lang w:val="es-US"/>
         </w:rPr>
       </w:pPr>
       <w:r>
@@ -270,7 +2162,7 @@
           <w:rStyle w:val="normaltextrun"/>
           <w:rFonts w:ascii="Times New Roman" w:eastAsia="Times New Roman" w:hAnsi="Times New Roman" w:cs="Times New Roman"/>
           <w:kern w:val="0"/>
-          <w:lang w:val="es-ES" w:eastAsia="es-GT"/>
+          <w:lang w:val="es-US" w:eastAsia="es-GT"/>
           <w14:ligatures w14:val="none"/>
         </w:rPr>
         <w:t xml:space="preserve">Akash Nagaraj. (2018). ASL </w:t>
@@ -281,7 +2173,7 @@
           <w:rStyle w:val="normaltextrun"/>
           <w:rFonts w:ascii="Times New Roman" w:eastAsia="Times New Roman" w:hAnsi="Times New Roman" w:cs="Times New Roman"/>
           <w:kern w:val="0"/>
-          <w:lang w:val="es-ES" w:eastAsia="es-GT"/>
+          <w:lang w:val="es-US" w:eastAsia="es-GT"/>
           <w14:ligatures w14:val="none"/>
         </w:rPr>
         <w:t>Alphabet</w:t>
@@ -292,7 +2184,7 @@
           <w:rStyle w:val="normaltextrun"/>
           <w:rFonts w:ascii="Times New Roman" w:eastAsia="Times New Roman" w:hAnsi="Times New Roman" w:cs="Times New Roman"/>
           <w:kern w:val="0"/>
-          <w:lang w:val="es-ES" w:eastAsia="es-GT"/>
+          <w:lang w:val="es-US" w:eastAsia="es-GT"/>
           <w14:ligatures w14:val="none"/>
         </w:rPr>
         <w:t xml:space="preserve"> [</w:t>
@@ -303,7 +2195,7 @@
           <w:rStyle w:val="normaltextrun"/>
           <w:rFonts w:ascii="Times New Roman" w:eastAsia="Times New Roman" w:hAnsi="Times New Roman" w:cs="Times New Roman"/>
           <w:kern w:val="0"/>
-          <w:lang w:val="es-ES" w:eastAsia="es-GT"/>
+          <w:lang w:val="es-US" w:eastAsia="es-GT"/>
           <w14:ligatures w14:val="none"/>
         </w:rPr>
         <w:t>Dataset</w:t>
@@ -314,7 +2206,7 @@
           <w:rStyle w:val="normaltextrun"/>
           <w:rFonts w:ascii="Times New Roman" w:eastAsia="Times New Roman" w:hAnsi="Times New Roman" w:cs="Times New Roman"/>
           <w:kern w:val="0"/>
-          <w:lang w:val="es-ES" w:eastAsia="es-GT"/>
+          <w:lang w:val="es-US" w:eastAsia="es-GT"/>
           <w14:ligatures w14:val="none"/>
         </w:rPr>
         <w:t xml:space="preserve">]. </w:t>
@@ -325,7 +2217,7 @@
           <w:rStyle w:val="normaltextrun"/>
           <w:rFonts w:ascii="Times New Roman" w:eastAsia="Times New Roman" w:hAnsi="Times New Roman" w:cs="Times New Roman"/>
           <w:kern w:val="0"/>
-          <w:lang w:val="es-ES" w:eastAsia="es-GT"/>
+          <w:lang w:val="es-US" w:eastAsia="es-GT"/>
           <w14:ligatures w14:val="none"/>
         </w:rPr>
         <w:t>Kaggle</w:t>
@@ -336,18 +2228,18 @@
           <w:rStyle w:val="normaltextrun"/>
           <w:rFonts w:ascii="Times New Roman" w:eastAsia="Times New Roman" w:hAnsi="Times New Roman" w:cs="Times New Roman"/>
           <w:kern w:val="0"/>
-          <w:lang w:val="es-ES" w:eastAsia="es-GT"/>
+          <w:lang w:val="es-US" w:eastAsia="es-GT"/>
           <w14:ligatures w14:val="none"/>
         </w:rPr>
         <w:t xml:space="preserve">. </w:t>
       </w:r>
-      <w:hyperlink r:id="rId6" w:history="1">
+      <w:hyperlink r:id="rId7" w:history="1">
         <w:r>
           <w:rPr>
             <w:rStyle w:val="Hyperlink"/>
             <w:rFonts w:ascii="Times New Roman" w:eastAsia="Times New Roman" w:hAnsi="Times New Roman" w:cs="Times New Roman"/>
             <w:kern w:val="0"/>
-            <w:lang w:val="es-ES" w:eastAsia="es-GT"/>
+            <w:lang w:val="es-US" w:eastAsia="es-GT"/>
             <w14:ligatures w14:val="none"/>
           </w:rPr>
           <w:t>https://doi.org/10.34740/KAGGLE/DSV/29550</w:t>
@@ -358,7 +2250,7 @@
           <w:rStyle w:val="normaltextrun"/>
           <w:rFonts w:ascii="Times New Roman" w:eastAsia="Times New Roman" w:hAnsi="Times New Roman" w:cs="Times New Roman"/>
           <w:kern w:val="0"/>
-          <w:lang w:val="es-ES" w:eastAsia="es-GT"/>
+          <w:lang w:val="es-US" w:eastAsia="es-GT"/>
           <w14:ligatures w14:val="none"/>
         </w:rPr>
         <w:t xml:space="preserve"> </w:t>
@@ -368,7 +2260,7 @@
       <w:pPr>
         <w:jc w:val="both"/>
         <w:rPr>
-          <w:lang w:val="es-ES"/>
+          <w:lang w:val="es-US"/>
         </w:rPr>
       </w:pPr>
     </w:p>
@@ -376,13 +2268,16 @@
       <w:pPr>
         <w:jc w:val="both"/>
         <w:rPr>
-          <w:lang w:val="es-ES"/>
+          <w:lang w:val="es-US"/>
         </w:rPr>
       </w:pPr>
     </w:p>
     <w:p>
       <w:pPr>
         <w:jc w:val="both"/>
+        <w:rPr>
+          <w:lang w:val="es-US"/>
+        </w:rPr>
       </w:pPr>
     </w:p>
     <w:sectPr>
@@ -398,6 +2293,92 @@
 <file path=word/numbering.xml><?xml version="1.0" encoding="utf-8"?>
 <w:numbering xmlns:wpc="http://schemas.microsoft.com/office/word/2010/wordprocessingCanvas" xmlns:cx="http://schemas.microsoft.com/office/drawing/2014/chartex" xmlns:cx1="http://schemas.microsoft.com/office/drawing/2015/9/8/chartex" xmlns:cx2="http://schemas.microsoft.com/office/drawing/2015/10/21/chartex" xmlns:cx3="http://schemas.microsoft.com/office/drawing/2016/5/9/chartex" xmlns:cx4="http://schemas.microsoft.com/office/drawing/2016/5/10/chartex" xmlns:cx5="http://schemas.microsoft.com/office/drawing/2016/5/11/chartex" xmlns:cx6="http://schemas.microsoft.com/office/drawing/2016/5/12/chartex" xmlns:cx7="http://schemas.microsoft.com/office/drawing/2016/5/13/chartex" xmlns:cx8="http://schemas.microsoft.com/office/drawing/2016/5/14/chartex" xmlns:mc="http://schemas.openxmlformats.org/markup-compatibility/2006" xmlns:aink="http://schemas.microsoft.com/office/drawing/2016/ink" xmlns:am3d="http://schemas.microsoft.com/office/drawing/2017/model3d" xmlns:o="urn:schemas-microsoft-com:office:office" xmlns:oel="http://schemas.microsoft.com/office/2019/extlst" xmlns:r="http://schemas.openxmlformats.org/officeDocument/2006/relationships" xmlns:m="http://schemas.openxmlformats.org/officeDocument/2006/math" xmlns:v="urn:schemas-microsoft-com:vml" xmlns:wp14="http://schemas.microsoft.com/office/word/2010/wordprocessingDrawing" xmlns:wp="http://schemas.openxmlformats.org/drawingml/2006/wordprocessingDrawing" xmlns:w10="urn:schemas-microsoft-com:office:word" xmlns:w="http://schemas.openxmlformats.org/wordprocessingml/2006/main" xmlns:w14="http://schemas.microsoft.com/office/word/2010/wordml" xmlns:w15="http://schemas.microsoft.com/office/word/2012/wordml" xmlns:w16cei="http://schemas.microsoft.com/office/word/2026/wordml/cei" xmlns:w16cex="http://schemas.microsoft.com/office/word/2018/wordml/cex" xmlns:w16cid="http://schemas.microsoft.com/office/word/2016/wordml/cid" xmlns:w16="http://schemas.microsoft.com/office/word/2018/wordml" xmlns:w16du="http://schemas.microsoft.com/office/word/2023/wordml/word16du" xmlns:w16sdtdh="http://schemas.microsoft.com/office/word/2020/wordml/sdtdatahash" xmlns:w16sdtfl="http://schemas.microsoft.com/office/word/2024/wordml/sdtformatlock" xmlns:w16se="http://schemas.microsoft.com/office/word/2015/wordml/symex" xmlns:wpg="http://schemas.microsoft.com/office/word/2010/wordprocessingGroup" xmlns:wpi="http://schemas.microsoft.com/office/word/2010/wordprocessingInk" xmlns:wne="http://schemas.microsoft.com/office/word/2006/wordml" xmlns:wps="http://schemas.microsoft.com/office/word/2010/wordprocessingShape" mc:Ignorable="w14 w15 w16se w16cid w16 w16cex w16sdtdh w16sdtfl w16du wp14">
   <w:abstractNum w:abstractNumId="0" w15:restartNumberingAfterBreak="0">
+    <w:nsid w:val="0649535D"/>
+    <w:multiLevelType w:val="hybridMultilevel"/>
+    <w:tmpl w:val="A60E19A6"/>
+    <w:lvl w:ilvl="0" w:tplc="100A000F">
+      <w:start w:val="1"/>
+      <w:numFmt w:val="decimal"/>
+      <w:lvlText w:val="%1."/>
+      <w:lvlJc w:val="left"/>
+      <w:pPr>
+        <w:ind w:left="720" w:hanging="360"/>
+      </w:pPr>
+    </w:lvl>
+    <w:lvl w:ilvl="1" w:tplc="100A0019" w:tentative="1">
+      <w:start w:val="1"/>
+      <w:numFmt w:val="lowerLetter"/>
+      <w:lvlText w:val="%2."/>
+      <w:lvlJc w:val="left"/>
+      <w:pPr>
+        <w:ind w:left="1440" w:hanging="360"/>
+      </w:pPr>
+    </w:lvl>
+    <w:lvl w:ilvl="2" w:tplc="100A001B" w:tentative="1">
+      <w:start w:val="1"/>
+      <w:numFmt w:val="lowerRoman"/>
+      <w:lvlText w:val="%3."/>
+      <w:lvlJc w:val="right"/>
+      <w:pPr>
+        <w:ind w:left="2160" w:hanging="180"/>
+      </w:pPr>
+    </w:lvl>
+    <w:lvl w:ilvl="3" w:tplc="100A000F" w:tentative="1">
+      <w:start w:val="1"/>
+      <w:numFmt w:val="decimal"/>
+      <w:lvlText w:val="%4."/>
+      <w:lvlJc w:val="left"/>
+      <w:pPr>
+        <w:ind w:left="2880" w:hanging="360"/>
+      </w:pPr>
+    </w:lvl>
+    <w:lvl w:ilvl="4" w:tplc="100A0019" w:tentative="1">
+      <w:start w:val="1"/>
+      <w:numFmt w:val="lowerLetter"/>
+      <w:lvlText w:val="%5."/>
+      <w:lvlJc w:val="left"/>
+      <w:pPr>
+        <w:ind w:left="3600" w:hanging="360"/>
+      </w:pPr>
+    </w:lvl>
+    <w:lvl w:ilvl="5" w:tplc="100A001B" w:tentative="1">
+      <w:start w:val="1"/>
+      <w:numFmt w:val="lowerRoman"/>
+      <w:lvlText w:val="%6."/>
+      <w:lvlJc w:val="right"/>
+      <w:pPr>
+        <w:ind w:left="4320" w:hanging="180"/>
+      </w:pPr>
+    </w:lvl>
+    <w:lvl w:ilvl="6" w:tplc="100A000F" w:tentative="1">
+      <w:start w:val="1"/>
+      <w:numFmt w:val="decimal"/>
+      <w:lvlText w:val="%7."/>
+      <w:lvlJc w:val="left"/>
+      <w:pPr>
+        <w:ind w:left="5040" w:hanging="360"/>
+      </w:pPr>
+    </w:lvl>
+    <w:lvl w:ilvl="7" w:tplc="100A0019" w:tentative="1">
+      <w:start w:val="1"/>
+      <w:numFmt w:val="lowerLetter"/>
+      <w:lvlText w:val="%8."/>
+      <w:lvlJc w:val="left"/>
+      <w:pPr>
+        <w:ind w:left="5760" w:hanging="360"/>
+      </w:pPr>
+    </w:lvl>
+    <w:lvl w:ilvl="8" w:tplc="100A001B" w:tentative="1">
+      <w:start w:val="1"/>
+      <w:numFmt w:val="lowerRoman"/>
+      <w:lvlText w:val="%9."/>
+      <w:lvlJc w:val="right"/>
+      <w:pPr>
+        <w:ind w:left="6480" w:hanging="180"/>
+      </w:pPr>
+    </w:lvl>
+  </w:abstractNum>
+  <w:abstractNum w:abstractNumId="1" w15:restartNumberingAfterBreak="0">
     <w:nsid w:val="3AF160A5"/>
     <w:multiLevelType w:val="hybridMultilevel"/>
     <w:tmpl w:val="E4845D46"/>
@@ -483,7 +2464,93 @@
       </w:pPr>
     </w:lvl>
   </w:abstractNum>
-  <w:abstractNum w:abstractNumId="1" w15:restartNumberingAfterBreak="0">
+  <w:abstractNum w:abstractNumId="2" w15:restartNumberingAfterBreak="0">
+    <w:nsid w:val="425E4108"/>
+    <w:multiLevelType w:val="hybridMultilevel"/>
+    <w:tmpl w:val="2BCA64C2"/>
+    <w:lvl w:ilvl="0" w:tplc="100A000F">
+      <w:start w:val="1"/>
+      <w:numFmt w:val="decimal"/>
+      <w:lvlText w:val="%1."/>
+      <w:lvlJc w:val="left"/>
+      <w:pPr>
+        <w:ind w:left="720" w:hanging="360"/>
+      </w:pPr>
+    </w:lvl>
+    <w:lvl w:ilvl="1" w:tplc="100A0019" w:tentative="1">
+      <w:start w:val="1"/>
+      <w:numFmt w:val="lowerLetter"/>
+      <w:lvlText w:val="%2."/>
+      <w:lvlJc w:val="left"/>
+      <w:pPr>
+        <w:ind w:left="1440" w:hanging="360"/>
+      </w:pPr>
+    </w:lvl>
+    <w:lvl w:ilvl="2" w:tplc="100A001B" w:tentative="1">
+      <w:start w:val="1"/>
+      <w:numFmt w:val="lowerRoman"/>
+      <w:lvlText w:val="%3."/>
+      <w:lvlJc w:val="right"/>
+      <w:pPr>
+        <w:ind w:left="2160" w:hanging="180"/>
+      </w:pPr>
+    </w:lvl>
+    <w:lvl w:ilvl="3" w:tplc="100A000F" w:tentative="1">
+      <w:start w:val="1"/>
+      <w:numFmt w:val="decimal"/>
+      <w:lvlText w:val="%4."/>
+      <w:lvlJc w:val="left"/>
+      <w:pPr>
+        <w:ind w:left="2880" w:hanging="360"/>
+      </w:pPr>
+    </w:lvl>
+    <w:lvl w:ilvl="4" w:tplc="100A0019" w:tentative="1">
+      <w:start w:val="1"/>
+      <w:numFmt w:val="lowerLetter"/>
+      <w:lvlText w:val="%5."/>
+      <w:lvlJc w:val="left"/>
+      <w:pPr>
+        <w:ind w:left="3600" w:hanging="360"/>
+      </w:pPr>
+    </w:lvl>
+    <w:lvl w:ilvl="5" w:tplc="100A001B" w:tentative="1">
+      <w:start w:val="1"/>
+      <w:numFmt w:val="lowerRoman"/>
+      <w:lvlText w:val="%6."/>
+      <w:lvlJc w:val="right"/>
+      <w:pPr>
+        <w:ind w:left="4320" w:hanging="180"/>
+      </w:pPr>
+    </w:lvl>
+    <w:lvl w:ilvl="6" w:tplc="100A000F" w:tentative="1">
+      <w:start w:val="1"/>
+      <w:numFmt w:val="decimal"/>
+      <w:lvlText w:val="%7."/>
+      <w:lvlJc w:val="left"/>
+      <w:pPr>
+        <w:ind w:left="5040" w:hanging="360"/>
+      </w:pPr>
+    </w:lvl>
+    <w:lvl w:ilvl="7" w:tplc="100A0019" w:tentative="1">
+      <w:start w:val="1"/>
+      <w:numFmt w:val="lowerLetter"/>
+      <w:lvlText w:val="%8."/>
+      <w:lvlJc w:val="left"/>
+      <w:pPr>
+        <w:ind w:left="5760" w:hanging="360"/>
+      </w:pPr>
+    </w:lvl>
+    <w:lvl w:ilvl="8" w:tplc="100A001B" w:tentative="1">
+      <w:start w:val="1"/>
+      <w:numFmt w:val="lowerRoman"/>
+      <w:lvlText w:val="%9."/>
+      <w:lvlJc w:val="right"/>
+      <w:pPr>
+        <w:ind w:left="6480" w:hanging="180"/>
+      </w:pPr>
+    </w:lvl>
+  </w:abstractNum>
+  <w:abstractNum w:abstractNumId="3" w15:restartNumberingAfterBreak="0">
     <w:nsid w:val="5B3E2355"/>
     <w:multiLevelType w:val="hybridMultilevel"/>
     <w:tmpl w:val="4B8A7D16"/>
@@ -569,11 +2636,106 @@
       </w:pPr>
     </w:lvl>
   </w:abstractNum>
+  <w:abstractNum w:abstractNumId="4" w15:restartNumberingAfterBreak="0">
+    <w:nsid w:val="6D162C06"/>
+    <w:multiLevelType w:val="hybridMultilevel"/>
+    <w:tmpl w:val="56102C18"/>
+    <w:lvl w:ilvl="0" w:tplc="100A000F">
+      <w:start w:val="1"/>
+      <w:numFmt w:val="decimal"/>
+      <w:lvlText w:val="%1."/>
+      <w:lvlJc w:val="left"/>
+      <w:pPr>
+        <w:ind w:left="720" w:hanging="360"/>
+      </w:pPr>
+    </w:lvl>
+    <w:lvl w:ilvl="1" w:tplc="100A0019" w:tentative="1">
+      <w:start w:val="1"/>
+      <w:numFmt w:val="lowerLetter"/>
+      <w:lvlText w:val="%2."/>
+      <w:lvlJc w:val="left"/>
+      <w:pPr>
+        <w:ind w:left="1440" w:hanging="360"/>
+      </w:pPr>
+    </w:lvl>
+    <w:lvl w:ilvl="2" w:tplc="100A001B" w:tentative="1">
+      <w:start w:val="1"/>
+      <w:numFmt w:val="lowerRoman"/>
+      <w:lvlText w:val="%3."/>
+      <w:lvlJc w:val="right"/>
+      <w:pPr>
+        <w:ind w:left="2160" w:hanging="180"/>
+      </w:pPr>
+    </w:lvl>
+    <w:lvl w:ilvl="3" w:tplc="100A000F" w:tentative="1">
+      <w:start w:val="1"/>
+      <w:numFmt w:val="decimal"/>
+      <w:lvlText w:val="%4."/>
+      <w:lvlJc w:val="left"/>
+      <w:pPr>
+        <w:ind w:left="2880" w:hanging="360"/>
+      </w:pPr>
+    </w:lvl>
+    <w:lvl w:ilvl="4" w:tplc="100A0019" w:tentative="1">
+      <w:start w:val="1"/>
+      <w:numFmt w:val="lowerLetter"/>
+      <w:lvlText w:val="%5."/>
+      <w:lvlJc w:val="left"/>
+      <w:pPr>
+        <w:ind w:left="3600" w:hanging="360"/>
+      </w:pPr>
+    </w:lvl>
+    <w:lvl w:ilvl="5" w:tplc="100A001B" w:tentative="1">
+      <w:start w:val="1"/>
+      <w:numFmt w:val="lowerRoman"/>
+      <w:lvlText w:val="%6."/>
+      <w:lvlJc w:val="right"/>
+      <w:pPr>
+        <w:ind w:left="4320" w:hanging="180"/>
+      </w:pPr>
+    </w:lvl>
+    <w:lvl w:ilvl="6" w:tplc="100A000F" w:tentative="1">
+      <w:start w:val="1"/>
+      <w:numFmt w:val="decimal"/>
+      <w:lvlText w:val="%7."/>
+      <w:lvlJc w:val="left"/>
+      <w:pPr>
+        <w:ind w:left="5040" w:hanging="360"/>
+      </w:pPr>
+    </w:lvl>
+    <w:lvl w:ilvl="7" w:tplc="100A0019" w:tentative="1">
+      <w:start w:val="1"/>
+      <w:numFmt w:val="lowerLetter"/>
+      <w:lvlText w:val="%8."/>
+      <w:lvlJc w:val="left"/>
+      <w:pPr>
+        <w:ind w:left="5760" w:hanging="360"/>
+      </w:pPr>
+    </w:lvl>
+    <w:lvl w:ilvl="8" w:tplc="100A001B" w:tentative="1">
+      <w:start w:val="1"/>
+      <w:numFmt w:val="lowerRoman"/>
+      <w:lvlText w:val="%9."/>
+      <w:lvlJc w:val="right"/>
+      <w:pPr>
+        <w:ind w:left="6480" w:hanging="180"/>
+      </w:pPr>
+    </w:lvl>
+  </w:abstractNum>
   <w:num w:numId="1" w16cid:durableId="1006788578">
-    <w:abstractNumId w:val="0"/>
+    <w:abstractNumId w:val="1"/>
   </w:num>
   <w:num w:numId="2" w16cid:durableId="1608275835">
-    <w:abstractNumId w:val="1"/>
+    <w:abstractNumId w:val="3"/>
+  </w:num>
+  <w:num w:numId="3" w16cid:durableId="1683362198">
+    <w:abstractNumId w:val="4"/>
+  </w:num>
+  <w:num w:numId="4" w16cid:durableId="1697653556">
+    <w:abstractNumId w:val="2"/>
+  </w:num>
+  <w:num w:numId="5" w16cid:durableId="822500858">
+    <w:abstractNumId w:val="0"/>
   </w:num>
 </w:numbering>
 </file>
@@ -1006,7 +3168,6 @@
     <w:next w:val="Normal"/>
     <w:link w:val="Heading2Char"/>
     <w:uiPriority w:val="9"/>
-    <w:semiHidden/>
     <w:unhideWhenUsed/>
     <w:qFormat/>
     <w:rsid w:val="00E43F1E"/>
@@ -1181,7 +3342,6 @@
   <w:style w:type="character" w:default="1" w:styleId="DefaultParagraphFont">
     <w:name w:val="Default Paragraph Font"/>
     <w:uiPriority w:val="1"/>
-    <w:semiHidden/>
     <w:unhideWhenUsed/>
   </w:style>
   <w:style w:type="table" w:default="1" w:styleId="TableNormal">
@@ -1223,7 +3383,6 @@
     <w:basedOn w:val="DefaultParagraphFont"/>
     <w:link w:val="Heading2"/>
     <w:uiPriority w:val="9"/>
-    <w:semiHidden/>
     <w:rsid w:val="00E43F1E"/>
     <w:rPr>
       <w:rFonts w:asciiTheme="majorHAnsi" w:eastAsiaTheme="majorEastAsia" w:hAnsiTheme="majorHAnsi" w:cstheme="majorBidi"/>
@@ -1561,6 +3720,126 @@
       <w:shd w:val="clear" w:color="auto" w:fill="E1DFDD"/>
     </w:rPr>
   </w:style>
+  <w:style w:type="table" w:styleId="PlainTable5">
+    <w:name w:val="Plain Table 5"/>
+    <w:basedOn w:val="TableNormal"/>
+    <w:uiPriority w:val="45"/>
+    <w:rsid w:val="007004C0"/>
+    <w:pPr>
+      <w:spacing w:after="0" w:line="240" w:lineRule="auto"/>
+    </w:pPr>
+    <w:tblPr>
+      <w:tblStyleRowBandSize w:val="1"/>
+      <w:tblStyleColBandSize w:val="1"/>
+    </w:tblPr>
+    <w:tblStylePr w:type="firstRow">
+      <w:rPr>
+        <w:rFonts w:asciiTheme="majorHAnsi" w:eastAsiaTheme="majorEastAsia" w:hAnsiTheme="majorHAnsi" w:cstheme="majorBidi"/>
+        <w:i/>
+        <w:iCs/>
+        <w:sz w:val="26"/>
+      </w:rPr>
+      <w:tblPr/>
+      <w:tcPr>
+        <w:tcBorders>
+          <w:bottom w:val="single" w:sz="4" w:space="0" w:color="7F7F7F" w:themeColor="text1" w:themeTint="80"/>
+        </w:tcBorders>
+        <w:shd w:val="clear" w:color="auto" w:fill="FFFFFF" w:themeFill="background1"/>
+      </w:tcPr>
+    </w:tblStylePr>
+    <w:tblStylePr w:type="lastRow">
+      <w:rPr>
+        <w:rFonts w:asciiTheme="majorHAnsi" w:eastAsiaTheme="majorEastAsia" w:hAnsiTheme="majorHAnsi" w:cstheme="majorBidi"/>
+        <w:i/>
+        <w:iCs/>
+        <w:sz w:val="26"/>
+      </w:rPr>
+      <w:tblPr/>
+      <w:tcPr>
+        <w:tcBorders>
+          <w:top w:val="single" w:sz="4" w:space="0" w:color="7F7F7F" w:themeColor="text1" w:themeTint="80"/>
+        </w:tcBorders>
+        <w:shd w:val="clear" w:color="auto" w:fill="FFFFFF" w:themeFill="background1"/>
+      </w:tcPr>
+    </w:tblStylePr>
+    <w:tblStylePr w:type="firstCol">
+      <w:pPr>
+        <w:jc w:val="right"/>
+      </w:pPr>
+      <w:rPr>
+        <w:rFonts w:asciiTheme="majorHAnsi" w:eastAsiaTheme="majorEastAsia" w:hAnsiTheme="majorHAnsi" w:cstheme="majorBidi"/>
+        <w:i/>
+        <w:iCs/>
+        <w:sz w:val="26"/>
+      </w:rPr>
+      <w:tblPr/>
+      <w:tcPr>
+        <w:tcBorders>
+          <w:right w:val="single" w:sz="4" w:space="0" w:color="7F7F7F" w:themeColor="text1" w:themeTint="80"/>
+        </w:tcBorders>
+        <w:shd w:val="clear" w:color="auto" w:fill="FFFFFF" w:themeFill="background1"/>
+      </w:tcPr>
+    </w:tblStylePr>
+    <w:tblStylePr w:type="lastCol">
+      <w:rPr>
+        <w:rFonts w:asciiTheme="majorHAnsi" w:eastAsiaTheme="majorEastAsia" w:hAnsiTheme="majorHAnsi" w:cstheme="majorBidi"/>
+        <w:i/>
+        <w:iCs/>
+        <w:sz w:val="26"/>
+      </w:rPr>
+      <w:tblPr/>
+      <w:tcPr>
+        <w:tcBorders>
+          <w:left w:val="single" w:sz="4" w:space="0" w:color="7F7F7F" w:themeColor="text1" w:themeTint="80"/>
+        </w:tcBorders>
+        <w:shd w:val="clear" w:color="auto" w:fill="FFFFFF" w:themeFill="background1"/>
+      </w:tcPr>
+    </w:tblStylePr>
+    <w:tblStylePr w:type="band1Vert">
+      <w:tblPr/>
+      <w:tcPr>
+        <w:shd w:val="clear" w:color="auto" w:fill="F2F2F2" w:themeFill="background1" w:themeFillShade="F2"/>
+      </w:tcPr>
+    </w:tblStylePr>
+    <w:tblStylePr w:type="band1Horz">
+      <w:tblPr/>
+      <w:tcPr>
+        <w:shd w:val="clear" w:color="auto" w:fill="F2F2F2" w:themeFill="background1" w:themeFillShade="F2"/>
+      </w:tcPr>
+    </w:tblStylePr>
+    <w:tblStylePr w:type="neCell">
+      <w:tblPr/>
+      <w:tcPr>
+        <w:tcBorders>
+          <w:left w:val="nil"/>
+        </w:tcBorders>
+      </w:tcPr>
+    </w:tblStylePr>
+    <w:tblStylePr w:type="nwCell">
+      <w:tblPr/>
+      <w:tcPr>
+        <w:tcBorders>
+          <w:right w:val="nil"/>
+        </w:tcBorders>
+      </w:tcPr>
+    </w:tblStylePr>
+    <w:tblStylePr w:type="seCell">
+      <w:tblPr/>
+      <w:tcPr>
+        <w:tcBorders>
+          <w:left w:val="nil"/>
+        </w:tcBorders>
+      </w:tcPr>
+    </w:tblStylePr>
+    <w:tblStylePr w:type="swCell">
+      <w:tblPr/>
+      <w:tcPr>
+        <w:tcBorders>
+          <w:right w:val="nil"/>
+        </w:tcBorders>
+      </w:tcPr>
+    </w:tblStylePr>
+  </w:style>
 </w:styles>
 </file>
 

</xml_diff>